<commit_message>
Rebuild v3.0 deck/LP/LG so Lab 3 checklist matches; tidy Step 7 prompt wrap
Co-Authored-By: Claude Opus 5.5 <noreply@anthropic.com>
</commit_message>
<xml_diff>
--- a/courseware/LG-Microsoft 365 Copilot for Excel.docx
+++ b/courseware/LG-Microsoft 365 Copilot for Excel.docx
@@ -968,7 +968,7 @@
         </w:rPr>
         <w:t>Topic 01 Recap - Mapped to Learning Outcomes</w:t>
         <w:tab/>
-        <w:t>41</w:t>
+        <w:t>40</w:t>
       </w:r>
     </w:p>
     <w:p>
@@ -987,7 +987,7 @@
         </w:rPr>
         <w:t>Topic 02 — Skills and Rules  (Labs 4-6)</w:t>
         <w:tab/>
-        <w:t>41</w:t>
+        <w:t>40</w:t>
       </w:r>
     </w:p>
     <w:p>
@@ -1047,7 +1047,7 @@
         </w:rPr>
         <w:t>Lab 4 · Workbook Rules &amp; Personalisation — Clean Messy Client Orders with Cleanup, Personalisation and Rules</w:t>
         <w:tab/>
-        <w:t>44</w:t>
+        <w:t>43</w:t>
       </w:r>
     </w:p>
     <w:p>
@@ -10502,21 +10502,7 @@
           <w:color w:val="0B3060"/>
           <w:sz w:val="19"/>
         </w:rPr>
-        <w:t>Review the four charts on the Charts sheet. For each, tell me which question it answers (Q1 Trend,</w:t>
-      </w:r>
-    </w:p>
-    <w:p>
-      <w:pPr>
-        <w:keepNext/>
-        <w:keepLines/>
-      </w:pPr>
-      <w:r>
-        <w:rPr>
-          <w:rFonts w:ascii="Consolas" w:hAnsi="Consolas"/>
-          <w:color w:val="0B3060"/>
-          <w:sz w:val="19"/>
-        </w:rPr>
-        <w:t>Q2 Comparison, Q3 Funnel, Q4 Efficiency), whether the chart type suits that question, and one improvement. Do not change anything.</w:t>
+        <w:t>Review the four charts on the Charts sheet. For each, tell me which question it answers (Q1 Trend, Q2 Comparison, Q3 Funnel, Q4 Efficiency), whether the chart type suits that question, and one improvement. Do not change anything.</w:t>
       </w:r>
     </w:p>
     <w:p>

</xml_diff>

<commit_message>
QA follow-ups: LG TOC pages, cover version, formula wrap, Lab 3 source totals
- inject_toc: match a heading where it starts a line, so the topic lead-in
  that lists concept names no longer steals the page (18 LG entries fixed).
- Deck cover: version line moved under the title, off the orange circle.
- Lab PDFs: long formula lines shrink to fit one line instead of wrapping
  mid-token (Lab 3 Step 3 SUMIFS copied broken).
- Lab 3 data: tblSources applications/hires now add up to tblMonthly's
  2026 totals (6,616 / 361). Referral still best rate, MyCareersFuture
  still lowest cost per hire.

Co-Authored-By: Claude Opus 5.5 <noreply@anthropic.com>
</commit_message>
<xml_diff>
--- a/courseware/LG-Microsoft 365 Copilot for Excel.docx
+++ b/courseware/LG-Microsoft 365 Copilot for Excel.docx
@@ -648,7 +648,7 @@
         </w:rPr>
         <w:t>Why Data Quality Matters</w:t>
         <w:tab/>
-        <w:t>7</w:t>
+        <w:t>8</w:t>
       </w:r>
     </w:p>
     <w:p>
@@ -668,7 +668,7 @@
         </w:rPr>
         <w:t>Chat Only, Plan and Allow Editing</w:t>
         <w:tab/>
-        <w:t>7</w:t>
+        <w:t>9</w:t>
       </w:r>
     </w:p>
     <w:p>
@@ -688,7 +688,7 @@
         </w:rPr>
         <w:t>Setup, Data Sources and the Model Picker</w:t>
         <w:tab/>
-        <w:t>7</w:t>
+        <w:t>11</w:t>
       </w:r>
     </w:p>
     <w:p>
@@ -708,7 +708,7 @@
         </w:rPr>
         <w:t>Cleaning Data with Copilot</w:t>
         <w:tab/>
-        <w:t>7</w:t>
+        <w:t>12</w:t>
       </w:r>
     </w:p>
     <w:p>
@@ -748,7 +748,7 @@
         </w:rPr>
         <w:t>What Is a Formula in Excel?</w:t>
         <w:tab/>
-        <w:t>19</w:t>
+        <w:t>20</w:t>
       </w:r>
     </w:p>
     <w:p>
@@ -768,7 +768,7 @@
         </w:rPr>
         <w:t>Table References: What Does @ Mean?</w:t>
         <w:tab/>
-        <w:t>19</w:t>
+        <w:t>21</w:t>
       </w:r>
     </w:p>
     <w:p>
@@ -788,7 +788,7 @@
         </w:rPr>
         <w:t>Reading Excel References: !, :, $ and [@[...]]</w:t>
         <w:tab/>
-        <w:t>19</w:t>
+        <w:t>22</w:t>
       </w:r>
     </w:p>
     <w:p>
@@ -808,7 +808,7 @@
         </w:rPr>
         <w:t>Reading a Formula: IF, AND and @</w:t>
         <w:tab/>
-        <w:t>19</w:t>
+        <w:t>23</w:t>
       </w:r>
     </w:p>
     <w:p>
@@ -828,7 +828,7 @@
         </w:rPr>
         <w:t>What Is XLOOKUP?</w:t>
         <w:tab/>
-        <w:t>19</w:t>
+        <w:t>24</w:t>
       </w:r>
     </w:p>
     <w:p>
@@ -848,7 +848,7 @@
         </w:rPr>
         <w:t>Writing Formulas and XLOOKUPs with Copilot</w:t>
         <w:tab/>
-        <w:t>19</w:t>
+        <w:t>25</w:t>
       </w:r>
     </w:p>
     <w:p>
@@ -908,7 +908,7 @@
         </w:rPr>
         <w:t>PivotTables and PivotCharts from a Prompt</w:t>
         <w:tab/>
-        <w:t>31</w:t>
+        <w:t>32</w:t>
       </w:r>
     </w:p>
     <w:p>
@@ -928,7 +928,7 @@
         </w:rPr>
         <w:t>Choosing and Refining Charts</w:t>
         <w:tab/>
-        <w:t>31</w:t>
+        <w:t>34</w:t>
       </w:r>
     </w:p>
     <w:p>
@@ -1027,7 +1027,7 @@
         </w:rPr>
         <w:t>Workbook Rules: The .Rules Sheet</w:t>
         <w:tab/>
-        <w:t>41</w:t>
+        <w:t>42</w:t>
       </w:r>
     </w:p>
     <w:p>
@@ -1087,7 +1087,7 @@
         </w:rPr>
         <w:t>Built-in Skills: Formatting, Visualisation and Finance</w:t>
         <w:tab/>
-        <w:t>50</w:t>
+        <w:t>51</w:t>
       </w:r>
     </w:p>
     <w:p>
@@ -1127,7 +1127,7 @@
         </w:rPr>
         <w:t>Custom Skills: The SKILL.md Recipe</w:t>
         <w:tab/>
-        <w:t>57</w:t>
+        <w:t>58</w:t>
       </w:r>
     </w:p>
     <w:p>
@@ -1147,7 +1147,7 @@
         </w:rPr>
         <w:t>Using Copilot to Write and Improve a Skill</w:t>
         <w:tab/>
-        <w:t>57</w:t>
+        <w:t>59</w:t>
       </w:r>
     </w:p>
     <w:p>
@@ -1246,7 +1246,7 @@
         </w:rPr>
         <w:t>Plan and Build with Rules and Skills</w:t>
         <w:tab/>
-        <w:t>66</w:t>
+        <w:t>68</w:t>
       </w:r>
     </w:p>
     <w:p>
@@ -1266,7 +1266,7 @@
         </w:rPr>
         <w:t>Interactivity: Slicers, Timelines and KPI Cards</w:t>
         <w:tab/>
-        <w:t>66</w:t>
+        <w:t>69</w:t>
       </w:r>
     </w:p>
     <w:p>
@@ -1326,7 +1326,7 @@
         </w:rPr>
         <w:t>A Reusable Dashboard Skill and the Refresh Test</w:t>
         <w:tab/>
-        <w:t>77</w:t>
+        <w:t>78</w:t>
       </w:r>
     </w:p>
     <w:p>
@@ -1346,7 +1346,7 @@
         </w:rPr>
         <w:t>Sharing People Dashboards Responsibly</w:t>
         <w:tab/>
-        <w:t>77</w:t>
+        <w:t>79</w:t>
       </w:r>
     </w:p>
     <w:p>
@@ -11216,7 +11216,7 @@
               <w:rPr>
                 <w:sz w:val="19"/>
               </w:rPr>
-              <w:t>Referral: highest hire rate (7.4%); MyCareersFuture: lowest cost per hire (S$186)</w:t>
+              <w:t>Referral: highest hire rate (8.7%); MyCareersFuture: lowest cost per hire (S$126)</w:t>
             </w:r>
           </w:p>
         </w:tc>

</xml_diff>

<commit_message>
Labs: open workbooks locally, not via OneDrive; Lab 6 skill fixes
- Shared setup step: copy the lab workbook into a local work-c34 folder and
  open it in desktop Excel; no onedrive.com upload or Excel for the web.
  OneDrive is kept only for custom skills (Labs 6, 8) and attaching files.
- Lab 6: Custom skills switch + "Add in OneDrive" button, Refresh wait,
  check the right workbook is open, troubleshooting for a missing
  tblInterviews. Workbook now opens on the Interviews sheet.
- About_This_Data: taller rows for long wrapped meanings.
- Lab 5 skill-folder wording (from the earlier pending edit).
- Rebuilt lab PDFs, sample prompts, prompts page, LG/LP/deck.

Co-Authored-By: Claude Opus 5.5 <noreply@anthropic.com>
</commit_message>
<xml_diff>
--- a/courseware/LG-Microsoft 365 Copilot for Excel.docx
+++ b/courseware/LG-Microsoft 365 Copilot for Excel.docx
@@ -888,7 +888,7 @@
         </w:rPr>
         <w:t>What Are PivotTables and PivotCharts?</w:t>
         <w:tab/>
-        <w:t>31</w:t>
+        <w:t>32</w:t>
       </w:r>
     </w:p>
     <w:p>
@@ -908,7 +908,7 @@
         </w:rPr>
         <w:t>PivotTables and PivotCharts from a Prompt</w:t>
         <w:tab/>
-        <w:t>32</w:t>
+        <w:t>33</w:t>
       </w:r>
     </w:p>
     <w:p>
@@ -1530,7 +1530,7 @@
         <w:pStyle w:val="ListBullet"/>
       </w:pPr>
       <w:r>
-        <w:t>A Windows or Mac laptop with a current Excel for Microsoft 365, or a browser for Excel for the web.</w:t>
+        <w:t>A Windows or Mac laptop with a current Excel for Microsoft 365 (desktop).</w:t>
       </w:r>
     </w:p>
     <w:p>
@@ -1546,7 +1546,7 @@
         <w:pStyle w:val="ListBullet"/>
       </w:pPr>
       <w:r>
-        <w:t>Access to your OneDrive in a browser, with a folder named work-c34. Custom skills (Labs 6 and 8) are stored in a OneDrive skills folder.</w:t>
+        <w:t>A folder named work-c34 on your computer for your working copies. OneDrive is needed only for custom skills (Labs 6 and 8), which Excel reads from a OneDrive skills folder.</w:t>
       </w:r>
     </w:p>
     <w:p>
@@ -1580,7 +1580,7 @@
     </w:p>
     <w:p>
       <w:r>
-        <w:t>Upload labs/lab-01-*/data/BrightPath_Candidate_Pipeline.xlsx to your OneDrive work-c34 folder and open it in Excel. Confirm that Formulas &gt; Calculation Options is Automatic and open Copilot. Check the mode menu above the prompt box (Chat only, Plan, Allow editing), the model picker at the top, the + (Add work content) menu and Settings (...) &gt; Personalization and Manage plugins &amp; skills. Labels and availability may change as Microsoft updates the product.</w:t>
+        <w:t>Copy labs/lab-01-*/data/BrightPath_Candidate_Pipeline.xlsx into your work-c34 folder and open it in Excel. Confirm that Formulas &gt; Calculation Options is Automatic and open Copilot. Check the mode menu above the prompt box (Chat only, Plan, Allow editing), the model picker at the top, the + (Add work content) menu and Settings (...) &gt; Personalization and Manage plugins &amp; skills. Labels and availability may change as Microsoft updates the product.</w:t>
       </w:r>
     </w:p>
     <w:p>
@@ -1692,7 +1692,7 @@
           <w:color w:val="0B3060"/>
           <w:sz w:val="19"/>
         </w:rPr>
-        <w:t>OneDrive/work-c34/              your cloud working copies</w:t>
+        <w:t>work-c34/                       your local working copies</w:t>
       </w:r>
     </w:p>
     <w:p>
@@ -2905,7 +2905,7 @@
     </w:p>
     <w:p>
       <w:r>
-        <w:t>Copilot appears in Excel for Microsoft 365 on Windows, Mac and the web when your account has an eligible plan, such as a Microsoft 365 Copilot licence on a work account. It needs an internet connection; saving the workbook to OneDrive or SharePoint adds AutoSave and version history, and recent builds also work on local files. From the + (Add work content) menu Copilot can use another file, web results or your work content as context, and the model picker at the top of the pane lets you choose Auto or a specific model.</w:t>
+        <w:t>Copilot appears in Excel for Microsoft 365 on Windows, Mac and the web when your account has an eligible plan, such as a Microsoft 365 Copilot licence on a work account. It needs an internet connection and works on workbooks saved on your computer; OneDrive or SharePoint is optional and adds AutoSave and version history. From the + (Add work content) menu Copilot can use another file, web results or your work content as context, and the model picker at the top of the pane lets you choose Auto or a specific model.</w:t>
       </w:r>
     </w:p>
     <w:p>
@@ -2934,7 +2934,7 @@
         <w:pStyle w:val="ListBullet"/>
       </w:pPr>
       <w:r>
-        <w:t>Save the workbook as .xlsx in OneDrive, set Formulas &gt; Calculation Options to Automatic and open Copilot.</w:t>
+        <w:t>Save the workbook as .xlsx on your computer, set Formulas &gt; Calculation Options to Automatic and open Copilot.</w:t>
       </w:r>
     </w:p>
     <w:p>
@@ -3606,7 +3606,7 @@
         <w:keepNext/>
       </w:pPr>
       <w:r>
-        <w:t>BrightPath_Candidate_Pipeline.xlsx in OneDrive with table tblApplications, a Source_Clean column, duplicate IDs highlighted, Hired rows highlighted, a verified source-by-hires answer and a filled Prompt_Log   (Tools: Excel for Microsoft 365 or Excel for the web · Copilot (Chat only, Plan, Allow editing, model picker) · BrightPath_Candidate_Pipeline.xlsx.)</w:t>
+        <w:t>BrightPath_Candidate_Pipeline.xlsx in your work-c34 folder with table tblApplications, a Source_Clean column, duplicate IDs highlighted, Hired rows highlighted, a verified source-by-hires answer and a filled Prompt_Log   (Tools: Excel for Microsoft 365 (desktop) · Copilot (Chat only, Plan, Allow editing, model picker) · BrightPath_Candidate_Pipeline.xlsx.)</w:t>
       </w:r>
     </w:p>
     <w:p>
@@ -3627,7 +3627,7 @@
         <w:pStyle w:val="ListBullet"/>
       </w:pPr>
       <w:r>
-        <w:t>A Microsoft 365 account with Copilot in Excel enabled, signed in to Excel or Excel for the web.</w:t>
+        <w:t>A Microsoft 365 account with Copilot in Excel enabled, signed in to Excel for Microsoft 365 (desktop).</w:t>
       </w:r>
     </w:p>
     <w:p>
@@ -3635,7 +3635,7 @@
         <w:pStyle w:val="ListBullet"/>
       </w:pPr>
       <w:r>
-        <w:t>A OneDrive or SharePoint folder named work-c34 that you can upload to.</w:t>
+        <w:t>A folder named work-c34 on your computer for your working copies.</w:t>
       </w:r>
     </w:p>
     <w:p>
@@ -3671,7 +3671,7 @@
         <w:t xml:space="preserve">1.  </w:t>
       </w:r>
       <w:r>
-        <w:t>Go to onedrive.com (or your SharePoint site), open or create the folder work-c34 and select Upload &gt; Files. Upload BrightPath_Candidate_Pipeline.xlsx from this lab's data folder, then open it in Excel for the web or select Open in Desktop App. OneDrive gives you AutoSave and version history (recent Excel builds can also run Copilot on local files). Check that Formulas &gt; Calculation Options is Automatic, then open Copilot from the Copilot button on the Home tab or the floating Copilot icon at the bottom right. Read the About_This_Data sheet before you prompt.</w:t>
+        <w:t>Copy BrightPath_Candidate_Pipeline.xlsx from this lab's data folder into a work-c34 folder on your computer and open it in Excel for Microsoft 365 (desktop). Work on this local copy - no OneDrive upload is needed. Check that Formulas &gt; Calculation Options is Automatic, then open Copilot from the Copilot button on the Home tab or the floating Copilot icon at the bottom right. Read the About_This_Data sheet before you prompt.</w:t>
       </w:r>
     </w:p>
     <w:p>
@@ -3699,7 +3699,7 @@
           <w:color w:val="0B3060"/>
           <w:sz w:val="19"/>
         </w:rPr>
-        <w:t>File      : OneDrive/work-c34/BrightPath_Candidate_Pipeline.xlsx</w:t>
+        <w:t>File      : work-c34/BrightPath_Candidate_Pipeline.xlsx (local copy)</w:t>
       </w:r>
     </w:p>
     <w:p>
@@ -3713,12 +3713,11 @@
           <w:color w:val="0B3060"/>
           <w:sz w:val="19"/>
         </w:rPr>
-        <w:t>AutoSave  : On (recommended, not required)</w:t>
-      </w:r>
-    </w:p>
-    <w:p>
-      <w:pPr>
-        <w:keepNext/>
+        <w:t>Calculation Options : Automatic</w:t>
+      </w:r>
+    </w:p>
+    <w:p>
+      <w:pPr>
         <w:keepLines/>
       </w:pPr>
       <w:r>
@@ -3727,11 +3726,27 @@
           <w:color w:val="0B3060"/>
           <w:sz w:val="19"/>
         </w:rPr>
-        <w:t>Calculation Options : Automatic</w:t>
-      </w:r>
-    </w:p>
-    <w:p>
-      <w:pPr>
+        <w:t>Sheets    : About_This_Data | Applications | Prompt_Log</w:t>
+      </w:r>
+    </w:p>
+    <w:p>
+      <w:pPr>
+        <w:spacing w:after="80"/>
+        <w:ind w:left="360"/>
+      </w:pPr>
+      <w:r>
+        <w:rPr>
+          <w:b/>
+        </w:rPr>
+        <w:t xml:space="preserve">2.  </w:t>
+      </w:r>
+      <w:r>
+        <w:t>Open Copilot and find the mode menu above the prompt box: Chat only (answers, no changes), Plan (shows its steps first) and Allow editing (makes the changes). Choose Allow editing and ask Copilot to turn the Applications data into a named table. Its reply must confirm tblApplications, 13 columns and 242 data rows. Select Done to keep the change, or Undo to reverse it. If Excel offers 'Clean data with Copilot', select Dismiss for now - you will use it in Lab 4.</w:t>
+      </w:r>
+    </w:p>
+    <w:p>
+      <w:pPr>
+        <w:keepNext/>
         <w:keepLines/>
       </w:pPr>
       <w:r>
@@ -3740,22 +3755,7 @@
           <w:color w:val="0B3060"/>
           <w:sz w:val="19"/>
         </w:rPr>
-        <w:t>Sheets    : About_This_Data | Applications | Prompt_Log</w:t>
-      </w:r>
-    </w:p>
-    <w:p>
-      <w:pPr>
-        <w:spacing w:after="80"/>
-        <w:ind w:left="360"/>
-      </w:pPr>
-      <w:r>
-        <w:rPr>
-          <w:b/>
-        </w:rPr>
-        <w:t xml:space="preserve">2.  </w:t>
-      </w:r>
-      <w:r>
-        <w:t>Open Copilot and find the mode menu above the prompt box: Chat only (answers, no changes), Plan (shows its steps first) and Allow editing (makes the changes). Choose Allow editing and ask Copilot to turn the Applications data into a named table. Its reply must confirm tblApplications, 13 columns and 242 data rows. Select Done to keep the change, or Undo to reverse it. If Excel offers 'Clean data with Copilot', select Dismiss for now - you will use it in Lab 4.</w:t>
+        <w:t>ALLOW EDITING:</w:t>
       </w:r>
     </w:p>
     <w:p>
@@ -3769,12 +3769,11 @@
           <w:color w:val="0B3060"/>
           <w:sz w:val="19"/>
         </w:rPr>
-        <w:t>ALLOW EDITING:</w:t>
-      </w:r>
-    </w:p>
-    <w:p>
-      <w:pPr>
-        <w:keepNext/>
+        <w:t>Format the data on the Applications sheet (from A1 to the last row and column) as an Excel table with headers. Name the table tblApplications. Do not change, sort or delete any values.</w:t>
+      </w:r>
+    </w:p>
+    <w:p>
+      <w:pPr>
         <w:keepLines/>
       </w:pPr>
       <w:r>
@@ -3783,11 +3782,27 @@
           <w:color w:val="0B3060"/>
           <w:sz w:val="19"/>
         </w:rPr>
-        <w:t>Format the data on the Applications sheet (from A1 to the last row and column) as an Excel table with headers. Name the table tblApplications. Do not change, sort or delete any values.</w:t>
-      </w:r>
-    </w:p>
-    <w:p>
-      <w:pPr>
+        <w:t>Then tell me the table name, the number of columns and the number of data rows.</w:t>
+      </w:r>
+    </w:p>
+    <w:p>
+      <w:pPr>
+        <w:spacing w:after="80"/>
+        <w:ind w:left="360"/>
+      </w:pPr>
+      <w:r>
+        <w:rPr>
+          <w:b/>
+        </w:rPr>
+        <w:t xml:space="preserve">3.  </w:t>
+      </w:r>
+      <w:r>
+        <w:t>Switch to Chat only (no workbook changes). Paste the prompt below. Copilot's row count must match the 242 rows it reported in Step 2. If Copilot already points out Source labels such as 'Linked In' or 'JobStreet ' (trailing space), note them - Step 4 checks and fixes them. You will log every prompt in Step 7.</w:t>
+      </w:r>
+    </w:p>
+    <w:p>
+      <w:pPr>
+        <w:keepNext/>
         <w:keepLines/>
       </w:pPr>
       <w:r>
@@ -3796,22 +3811,7 @@
           <w:color w:val="0B3060"/>
           <w:sz w:val="19"/>
         </w:rPr>
-        <w:t>Then tell me the table name, the number of columns and the number of data rows.</w:t>
-      </w:r>
-    </w:p>
-    <w:p>
-      <w:pPr>
-        <w:spacing w:after="80"/>
-        <w:ind w:left="360"/>
-      </w:pPr>
-      <w:r>
-        <w:rPr>
-          <w:b/>
-        </w:rPr>
-        <w:t xml:space="preserve">3.  </w:t>
-      </w:r>
-      <w:r>
-        <w:t>Switch to Chat only (no workbook changes). Paste the prompt below. Copilot's row count must match the 242 rows it reported in Step 2. If Copilot already points out Source labels such as 'Linked In' or 'JobStreet ' (trailing space), note them - Step 4 checks and fixes them. You will log every prompt in Step 7.</w:t>
+        <w:t>GOAL: Describe this candidate pipeline before I analyse it.</w:t>
       </w:r>
     </w:p>
     <w:p>
@@ -3825,7 +3825,7 @@
           <w:color w:val="0B3060"/>
           <w:sz w:val="19"/>
         </w:rPr>
-        <w:t>GOAL: Describe this candidate pipeline before I analyse it.</w:t>
+        <w:t>CONTEXT: BrightPath recruitment desk, H1 2026. One row should be one application.</w:t>
       </w:r>
     </w:p>
     <w:p>
@@ -3839,7 +3839,7 @@
           <w:color w:val="0B3060"/>
           <w:sz w:val="19"/>
         </w:rPr>
-        <w:t>CONTEXT: BrightPath recruitment desk, H1 2026. One row should be one application.</w:t>
+        <w:t>DATA: Use only tblApplications.</w:t>
       </w:r>
     </w:p>
     <w:p>
@@ -3853,7 +3853,7 @@
           <w:color w:val="0B3060"/>
           <w:sz w:val="19"/>
         </w:rPr>
-        <w:t>DATA: Use only tblApplications.</w:t>
+        <w:t>CONSTRAINTS: Do not change the workbook.</w:t>
       </w:r>
     </w:p>
     <w:p>
@@ -3867,12 +3867,11 @@
           <w:color w:val="0B3060"/>
           <w:sz w:val="19"/>
         </w:rPr>
-        <w:t>CONSTRAINTS: Do not change the workbook.</w:t>
-      </w:r>
-    </w:p>
-    <w:p>
-      <w:pPr>
-        <w:keepNext/>
+        <w:t>OUTPUT: What a row represents, each column with its data type, the number of rows, the Applied_Date range and the distinct values of Stage and Source.</w:t>
+      </w:r>
+    </w:p>
+    <w:p>
+      <w:pPr>
         <w:keepLines/>
       </w:pPr>
       <w:r>
@@ -3881,11 +3880,27 @@
           <w:color w:val="0B3060"/>
           <w:sz w:val="19"/>
         </w:rPr>
-        <w:t>OUTPUT: What a row represents, each column with its data type, the number of rows, the Applied_Date range and the distinct values of Stage and Source.</w:t>
-      </w:r>
-    </w:p>
-    <w:p>
-      <w:pPr>
+        <w:t>REVIEW: Tell me how you counted the rows.</w:t>
+      </w:r>
+    </w:p>
+    <w:p>
+      <w:pPr>
+        <w:spacing w:after="80"/>
+        <w:ind w:left="360"/>
+      </w:pPr>
+      <w:r>
+        <w:rPr>
+          <w:b/>
+        </w:rPr>
+        <w:t xml:space="preserve">4.  </w:t>
+      </w:r>
+      <w:r>
+        <w:t>Still in Chat only, ask Copilot to check data quality. It should report 2 repeated Application_IDs and Source values that are not in the canonical list on About_This_Data. Then switch to Plan mode and send the two changes: Copilot first shows its plan - read it, approve it, then select Done. Orange means 'this ID appears more than once': each duplicate ID is coloured in both places it occurs, so you see one orange cell near the top of the table and its twin further down (press Ctrl+End to jump to the last rows). Check that no row was deleted - the table must still have 242 rows.</w:t>
+      </w:r>
+    </w:p>
+    <w:p>
+      <w:pPr>
+        <w:keepNext/>
         <w:keepLines/>
       </w:pPr>
       <w:r>
@@ -3894,22 +3909,7 @@
           <w:color w:val="0B3060"/>
           <w:sz w:val="19"/>
         </w:rPr>
-        <w:t>REVIEW: Tell me how you counted the rows.</w:t>
-      </w:r>
-    </w:p>
-    <w:p>
-      <w:pPr>
-        <w:spacing w:after="80"/>
-        <w:ind w:left="360"/>
-      </w:pPr>
-      <w:r>
-        <w:rPr>
-          <w:b/>
-        </w:rPr>
-        <w:t xml:space="preserve">4.  </w:t>
-      </w:r>
-      <w:r>
-        <w:t>Still in Chat only, ask Copilot to check data quality. It should report 2 repeated Application_IDs and Source values that are not in the canonical list on About_This_Data. Then switch to Plan mode and send the two changes: Copilot first shows its plan - read it, approve it, then select Done. Orange means 'this ID appears more than once': each duplicate ID is coloured in both places it occurs, so you see one orange cell near the top of the table and its twin further down (press Ctrl+End to jump to the last rows). Check that no row was deleted - the table must still have 242 rows.</w:t>
+        <w:t>CHAT ONLY:</w:t>
       </w:r>
     </w:p>
     <w:p>
@@ -3923,7 +3923,7 @@
           <w:color w:val="0B3060"/>
           <w:sz w:val="19"/>
         </w:rPr>
-        <w:t>CHAT ONLY:</w:t>
+        <w:t>Check tblApplications for data-quality issues. List any Application_ID that appears more than once, and any Source value that is not exactly one of: LinkedIn, JobStreet, MyCareersFuture, Referral, BrightPath Website, Job Fair, Talent Database. Give the count of each issue. Do not change anything.</w:t>
       </w:r>
     </w:p>
     <w:p>
@@ -3937,7 +3937,6 @@
           <w:color w:val="0B3060"/>
           <w:sz w:val="19"/>
         </w:rPr>
-        <w:t>Check tblApplications for data-quality issues. List any Application_ID that appears more than once, and any Source value that is not exactly one of: LinkedIn, JobStreet, MyCareersFuture, Referral, BrightPath Website, Job Fair, Talent Database. Give the count of each issue. Do not change anything.</w:t>
       </w:r>
     </w:p>
     <w:p>
@@ -3951,6 +3950,7 @@
           <w:color w:val="0B3060"/>
           <w:sz w:val="19"/>
         </w:rPr>
+        <w:t>PLAN MODE:</w:t>
       </w:r>
     </w:p>
     <w:p>
@@ -3964,7 +3964,7 @@
           <w:color w:val="0B3060"/>
           <w:sz w:val="19"/>
         </w:rPr>
-        <w:t>PLAN MODE:</w:t>
+        <w:t>1) Highlight Application_ID cells that appear more than once in tblApplications with an orange fill.</w:t>
       </w:r>
     </w:p>
     <w:p>
@@ -3978,7 +3978,7 @@
           <w:color w:val="0B3060"/>
           <w:sz w:val="19"/>
         </w:rPr>
-        <w:t>1) Highlight Application_ID cells that appear more than once in tblApplications with an orange fill.</w:t>
+        <w:t>2) Add a column Source_Clean to tblApplications that trims spaces from Source and changes 'Linked In' to 'LinkedIn'. Do not delete or edit any existing values.</w:t>
       </w:r>
     </w:p>
     <w:p>
@@ -3992,7 +3992,6 @@
           <w:color w:val="0B3060"/>
           <w:sz w:val="19"/>
         </w:rPr>
-        <w:t>2) Add a column Source_Clean to tblApplications that trims spaces from Source and changes 'Linked In' to 'LinkedIn'. Do not delete or edit any existing values.</w:t>
       </w:r>
     </w:p>
     <w:p>
@@ -4006,6 +4005,7 @@
           <w:color w:val="0B3060"/>
           <w:sz w:val="19"/>
         </w:rPr>
+        <w:t>FOLLOW-UP: For each duplicated Application_ID, give the row numbers of both copies and say whether the two rows are identical.</w:t>
       </w:r>
     </w:p>
     <w:p>
@@ -4019,7 +4019,6 @@
           <w:color w:val="0B3060"/>
           <w:sz w:val="19"/>
         </w:rPr>
-        <w:t>FOLLOW-UP: For each duplicated Application_ID, give the row numbers of both copies and say whether the two rows are identical.</w:t>
       </w:r>
     </w:p>
     <w:p>
@@ -4033,6 +4032,7 @@
           <w:color w:val="0B3060"/>
           <w:sz w:val="19"/>
         </w:rPr>
+        <w:t>FOLLOW-UP: Highlight the Source cells in tblApplications where Source_Clean is different from Source with a yellow fill. Tell me how many cells you highlighted and list their Application_IDs.</w:t>
       </w:r>
     </w:p>
     <w:p>
@@ -4046,12 +4046,10 @@
           <w:color w:val="0B3060"/>
           <w:sz w:val="19"/>
         </w:rPr>
-        <w:t>FOLLOW-UP: Highlight the Source cells in tblApplications where Source_Clean is different from Source with a yellow fill. Tell me how many cells you highlighted and list their Application_IDs.</w:t>
-      </w:r>
-    </w:p>
-    <w:p>
-      <w:pPr>
-        <w:keepNext/>
+      </w:r>
+    </w:p>
+    <w:p>
+      <w:pPr>
         <w:keepLines/>
       </w:pPr>
       <w:r>
@@ -4060,10 +4058,27 @@
           <w:color w:val="0B3060"/>
           <w:sz w:val="19"/>
         </w:rPr>
-      </w:r>
-    </w:p>
-    <w:p>
-      <w:pPr>
+        <w:t>FOLLOW-UP: List the distinct Source_Clean values with a count of each. Confirm there is no 'Linked In' and no value with a trailing space, and that tblApplications still has 242 rows.</w:t>
+      </w:r>
+    </w:p>
+    <w:p>
+      <w:pPr>
+        <w:spacing w:after="80"/>
+        <w:ind w:left="360"/>
+      </w:pPr>
+      <w:r>
+        <w:rPr>
+          <w:b/>
+        </w:rPr>
+        <w:t xml:space="preserve">5.  </w:t>
+      </w:r>
+      <w:r>
+        <w:t>Ask Copilot a direct question about which sources produce hires, then ask Copilot (Allow editing) to add the two check formulas to a Checks sheet. Duplicate rows are Rejected applications, so they do not change the hire counts. Finally, open the model picker at the top of the pane (Auto by default), choose a different model, select New chat and ask the same question again. Both answers must match the Checks formulas - if a model disagrees, the formula wins.</w:t>
+      </w:r>
+    </w:p>
+    <w:p>
+      <w:pPr>
+        <w:keepNext/>
         <w:keepLines/>
       </w:pPr>
       <w:r>
@@ -4072,22 +4087,7 @@
           <w:color w:val="0B3060"/>
           <w:sz w:val="19"/>
         </w:rPr>
-        <w:t>FOLLOW-UP: List the distinct Source_Clean values with a count of each. Confirm there is no 'Linked In' and no value with a trailing space, and that tblApplications still has 242 rows.</w:t>
-      </w:r>
-    </w:p>
-    <w:p>
-      <w:pPr>
-        <w:spacing w:after="80"/>
-        <w:ind w:left="360"/>
-      </w:pPr>
-      <w:r>
-        <w:rPr>
-          <w:b/>
-        </w:rPr>
-        <w:t xml:space="preserve">5.  </w:t>
-      </w:r>
-      <w:r>
-        <w:t>Ask Copilot a direct question about which sources produce hires, then ask Copilot (Allow editing) to add the two check formulas to a Checks sheet. Duplicate rows are Rejected applications, so they do not change the hire counts. Finally, open the model picker at the top of the pane (Auto by default), choose a different model, select New chat and ask the same question again. Both answers must match the Checks formulas - if a model disagrees, the formula wins.</w:t>
+        <w:t>PROMPT (Chat only):</w:t>
       </w:r>
     </w:p>
     <w:p>
@@ -4101,7 +4101,7 @@
           <w:color w:val="0B3060"/>
           <w:sz w:val="19"/>
         </w:rPr>
-        <w:t>PROMPT (Chat only):</w:t>
+        <w:t>Using tblApplications, count applications and hires (Stage = "Hired") by Source_Clean.</w:t>
       </w:r>
     </w:p>
     <w:p>
@@ -4115,7 +4115,7 @@
           <w:color w:val="0B3060"/>
           <w:sz w:val="19"/>
         </w:rPr>
-        <w:t>Using tblApplications, count applications and hires (Stage = "Hired") by Source_Clean.</w:t>
+        <w:t>Show a table sorted by hires, highest first, with hire rate = hires / applications.</w:t>
       </w:r>
     </w:p>
     <w:p>
@@ -4129,7 +4129,6 @@
           <w:color w:val="0B3060"/>
           <w:sz w:val="19"/>
         </w:rPr>
-        <w:t>Show a table sorted by hires, highest first, with hire rate = hires / applications.</w:t>
       </w:r>
     </w:p>
     <w:p>
@@ -4143,6 +4142,7 @@
           <w:color w:val="0B3060"/>
           <w:sz w:val="19"/>
         </w:rPr>
+        <w:t>CHECK (Allow editing):</w:t>
       </w:r>
     </w:p>
     <w:p>
@@ -4156,7 +4156,7 @@
           <w:color w:val="0B3060"/>
           <w:sz w:val="19"/>
         </w:rPr>
-        <w:t>CHECK (Allow editing):</w:t>
+        <w:t>On a sheet named Checks (create it if needed), add these formulas with a label beside each, then tell me the results:</w:t>
       </w:r>
     </w:p>
     <w:p>
@@ -4170,7 +4170,7 @@
           <w:color w:val="0B3060"/>
           <w:sz w:val="19"/>
         </w:rPr>
-        <w:t>On a sheet named Checks (create it if needed), add these formulas with a label beside each, then tell me the results:</w:t>
+        <w:t>=COUNTIFS(tblApplications[Stage],"Hired")</w:t>
       </w:r>
     </w:p>
     <w:p>
@@ -4184,7 +4184,7 @@
           <w:color w:val="0B3060"/>
           <w:sz w:val="19"/>
         </w:rPr>
-        <w:t>=COUNTIFS(tblApplications[Stage],"Hired")</w:t>
+        <w:t>=COUNTIFS(tblApplications[Source_Clean],"LinkedIn",tblApplications[Stage],"Hired")</w:t>
       </w:r>
     </w:p>
     <w:p>
@@ -4198,7 +4198,6 @@
           <w:color w:val="0B3060"/>
           <w:sz w:val="19"/>
         </w:rPr>
-        <w:t>=COUNTIFS(tblApplications[Source_Clean],"LinkedIn",tblApplications[Stage],"Hired")</w:t>
       </w:r>
     </w:p>
     <w:p>
@@ -4212,6 +4211,7 @@
           <w:color w:val="0B3060"/>
           <w:sz w:val="19"/>
         </w:rPr>
+        <w:t>CHAT ONLY (new chat, different model):</w:t>
       </w:r>
     </w:p>
     <w:p>
@@ -4225,12 +4225,11 @@
           <w:color w:val="0B3060"/>
           <w:sz w:val="19"/>
         </w:rPr>
-        <w:t>CHAT ONLY (new chat, different model):</w:t>
-      </w:r>
-    </w:p>
-    <w:p>
-      <w:pPr>
-        <w:keepNext/>
+        <w:t>Using tblApplications, count applications and hires (Stage = "Hired") by Source_Clean.</w:t>
+      </w:r>
+    </w:p>
+    <w:p>
+      <w:pPr>
         <w:keepLines/>
       </w:pPr>
       <w:r>
@@ -4239,11 +4238,27 @@
           <w:color w:val="0B3060"/>
           <w:sz w:val="19"/>
         </w:rPr>
-        <w:t>Using tblApplications, count applications and hires (Stage = "Hired") by Source_Clean.</w:t>
-      </w:r>
-    </w:p>
-    <w:p>
-      <w:pPr>
+        <w:t>Show a table sorted by hires, highest first.</w:t>
+      </w:r>
+    </w:p>
+    <w:p>
+      <w:pPr>
+        <w:spacing w:after="80"/>
+        <w:ind w:left="360"/>
+      </w:pPr>
+      <w:r>
+        <w:rPr>
+          <w:b/>
+        </w:rPr>
+        <w:t xml:space="preserve">6.  </w:t>
+      </w:r>
+      <w:r>
+        <w:t>Switch to Allow editing and build a review view, one change at a time. After each change, look at the sheet and keep it or select Undo in the Copilot pane. Finally ask Copilot how many rows the filter shows, then ask it to clear the filter so all 242 rows return.</w:t>
+      </w:r>
+    </w:p>
+    <w:p>
+      <w:pPr>
+        <w:keepNext/>
         <w:keepLines/>
       </w:pPr>
       <w:r>
@@ -4252,22 +4267,7 @@
           <w:color w:val="0B3060"/>
           <w:sz w:val="19"/>
         </w:rPr>
-        <w:t>Show a table sorted by hires, highest first.</w:t>
-      </w:r>
-    </w:p>
-    <w:p>
-      <w:pPr>
-        <w:spacing w:after="80"/>
-        <w:ind w:left="360"/>
-      </w:pPr>
-      <w:r>
-        <w:rPr>
-          <w:b/>
-        </w:rPr>
-        <w:t xml:space="preserve">6.  </w:t>
-      </w:r>
-      <w:r>
-        <w:t>Switch to Allow editing and build a review view, one change at a time. After each change, look at the sheet and keep it or select Undo in the Copilot pane. Finally ask Copilot how many rows the filter shows, then ask it to clear the filter so all 242 rows return.</w:t>
+        <w:t>1) Highlight entire rows of tblApplications where Stage is "Hired" with a light green fill.</w:t>
       </w:r>
     </w:p>
     <w:p>
@@ -4281,7 +4281,7 @@
           <w:color w:val="0B3060"/>
           <w:sz w:val="19"/>
         </w:rPr>
-        <w:t>1) Highlight entire rows of tblApplications where Stage is "Hired" with a light green fill.</w:t>
+        <w:t>2) Sort tblApplications by Interview_Score from highest to lowest, then by Days_in_Pipeline from lowest to highest.</w:t>
       </w:r>
     </w:p>
     <w:p>
@@ -4295,7 +4295,7 @@
           <w:color w:val="0B3060"/>
           <w:sz w:val="19"/>
         </w:rPr>
-        <w:t>2) Sort tblApplications by Interview_Score from highest to lowest, then by Days_in_Pipeline from lowest to highest.</w:t>
+        <w:t>3) Filter tblApplications to show only Client_Sector = "Technology" and Stage = "Interview".</w:t>
       </w:r>
     </w:p>
     <w:p>
@@ -4309,12 +4309,11 @@
           <w:color w:val="0B3060"/>
           <w:sz w:val="19"/>
         </w:rPr>
-        <w:t>3) Filter tblApplications to show only Client_Sector = "Technology" and Stage = "Interview".</w:t>
-      </w:r>
-    </w:p>
-    <w:p>
-      <w:pPr>
-        <w:keepNext/>
+        <w:t>4) How many rows of tblApplications are visible with this filter?</w:t>
+      </w:r>
+    </w:p>
+    <w:p>
+      <w:pPr>
         <w:keepLines/>
       </w:pPr>
       <w:r>
@@ -4323,19 +4322,6 @@
           <w:color w:val="0B3060"/>
           <w:sz w:val="19"/>
         </w:rPr>
-        <w:t>4) How many rows of tblApplications are visible with this filter?</w:t>
-      </w:r>
-    </w:p>
-    <w:p>
-      <w:pPr>
-        <w:keepLines/>
-      </w:pPr>
-      <w:r>
-        <w:rPr>
-          <w:rFonts w:ascii="Consolas" w:hAnsi="Consolas"/>
-          <w:color w:val="0B3060"/>
-          <w:sz w:val="19"/>
-        </w:rPr>
         <w:t>5) Clear all filters on tblApplications and confirm all 242 rows are visible.</w:t>
       </w:r>
     </w:p>
@@ -4351,7 +4337,7 @@
         <w:t xml:space="preserve">7.  </w:t>
       </w:r>
       <w:r>
-        <w:t>Prompt_Log already lists every prompt in this lab with its step and mode. Ask Copilot to fill in what it did, how it was verified and your decision (Keep, Revise or Undo). With AutoSave on, the cloud copy and its version history stay current.</w:t>
+        <w:t>Prompt_Log already lists every prompt in this lab with its step and mode. Ask Copilot to fill in what it did, how it was verified and your decision (Keep, Revise or Undo). Save the workbook (Ctrl+S / Cmd+S) when it is done.</w:t>
       </w:r>
     </w:p>
     <w:p>
@@ -5253,7 +5239,7 @@
               <w:rPr>
                 <w:sz w:val="19"/>
               </w:rPr>
-              <w:t>Save the file as .xlsx in OneDrive or SharePoint, close and reopen it. Check your licence in your Microsoft 365 account and ask IT if Copilot is disabled for your tenant. Pair with a neighbour meanwhile.</w:t>
+              <w:t>Save the file as a normal .xlsx, close and reopen it, and update Excel. Check your licence in your Microsoft 365 account and ask IT if Copilot is disabled for your tenant. Pair with a neighbour meanwhile.</w:t>
             </w:r>
           </w:p>
         </w:tc>
@@ -5331,7 +5317,7 @@
               <w:rPr>
                 <w:sz w:val="19"/>
               </w:rPr>
-              <w:t>If the file is checked out in SharePoint, check it in and reopen it, or open it in Excel for the web. Strict Open XML files are not supported - save as a normal .xlsx.</w:t>
+              <w:t>Save as a normal .xlsx (Strict Open XML files are not supported), close and reopen it. If the file is read-only, copy it into work-c34 and open the copy.</w:t>
             </w:r>
           </w:p>
         </w:tc>
@@ -7355,7 +7341,7 @@
         <w:pStyle w:val="ListBullet"/>
       </w:pPr>
       <w:r>
-        <w:t>Lab 1 completed, or Copilot access confirmed on a OneDrive .xlsx file.</w:t>
+        <w:t>Lab 1 completed, or Copilot access confirmed on a local .xlsx file.</w:t>
       </w:r>
     </w:p>
     <w:p>
@@ -7391,7 +7377,7 @@
         <w:t xml:space="preserve">1.  </w:t>
       </w:r>
       <w:r>
-        <w:t>Go to onedrive.com (or your SharePoint site), open or create the folder work-c34 and select Upload &gt; Files. Upload BrightPath_Job_Requisitions.xlsx from this lab's data folder, then open it in Excel for the web or select Open in Desktop App. OneDrive gives you AutoSave and version history (recent Excel builds can also run Copilot on local files). Check that Formulas &gt; Calculation Options is Automatic, then open Copilot from the Copilot button on the Home tab or the floating Copilot icon at the bottom right. Read the About_This_Data sheet before you prompt. Note the fee rule: Est_Fee = Filled x Monthly_Salary_Budget x 12 x Fee_Rate, and the report date in Control!B1.</w:t>
+        <w:t>Copy BrightPath_Job_Requisitions.xlsx from this lab's data folder into a work-c34 folder on your computer and open it in Excel for Microsoft 365 (desktop). Work on this local copy - no OneDrive upload is needed. Check that Formulas &gt; Calculation Options is Automatic, then open Copilot from the Copilot button on the Home tab or the floating Copilot icon at the bottom right. Read the About_This_Data sheet before you prompt. Note the fee rule: Est_Fee = Filled x Monthly_Salary_Budget x 12 x Fee_Rate, and the report date in Control!B1.</w:t>
       </w:r>
     </w:p>
     <w:p>
@@ -8862,7 +8848,7 @@
               <w:rPr>
                 <w:sz w:val="19"/>
               </w:rPr>
-              <w:t>Confirm Calculation Options is Automatic and the data is an Excel table; try Excel for the web if desktop fails.</w:t>
+              <w:t>Confirm Calculation Options is Automatic and the data is an Excel table; if it still fails, save, close and reopen the workbook.</w:t>
             </w:r>
           </w:p>
         </w:tc>
@@ -8887,7 +8873,7 @@
         <w:keepNext/>
       </w:pPr>
       <w:r>
-        <w:t>Ask Copilot to add a Fee_Achieved column that is Est_Fee for Filled requisitions only, then build a small summary of Fee_Achieved by Sector with SUMIFS. Check that the sector totals add up to the grand total. Then bring in other data: upload Lab 1's BrightPath_Candidate_Pipeline.xlsx to work-c34, select + (Add work content) and attach it (or type / and its name), and ask: 'Add a sheet Sector_View that compares open requisitions by Sector in this workbook with hires by Client_Sector in the attached pipeline.' Check one sector's hires with COUNTIFS in the pipeline workbook.</w:t>
+        <w:t>Ask Copilot to add a Fee_Achieved column that is Est_Fee for Filled requisitions only, then build a small summary of Fee_Achieved by Sector with SUMIFS. Check that the sector totals add up to the grand total. Then bring in other data: select + (Add work content) and attach Lab 1's BrightPath_Candidate_Pipeline.xlsx (Copilot can only attach files it can find in your OneDrive or SharePoint, so skip this part if you work locally only), and ask: 'Add a sheet Sector_View that compares open requisitions by Sector in this workbook with hires by Client_Sector in the attached pipeline.' Check one sector's hires with COUNTIFS in the pipeline workbook.</w:t>
       </w:r>
     </w:p>
     <w:p>
@@ -9926,7 +9912,7 @@
         <w:pStyle w:val="ListBullet"/>
       </w:pPr>
       <w:r>
-        <w:t>Labs 1-2 completed: you can open a OneDrive workbook, switch Copilot modes and verify with formulas.</w:t>
+        <w:t>Labs 1-2 completed: you can open a lab workbook, switch Copilot modes and verify with formulas.</w:t>
       </w:r>
     </w:p>
     <w:p>
@@ -9962,7 +9948,7 @@
         <w:t xml:space="preserve">1.  </w:t>
       </w:r>
       <w:r>
-        <w:t>Go to onedrive.com (or your SharePoint site), open or create the folder work-c34 and select Upload &gt; Files. Upload BrightPath_Recruitment_Metrics.xlsx from this lab's data folder, then open it in Excel for the web or select Open in Desktop App. OneDrive gives you AutoSave and version history (recent Excel builds can also run Copilot on local files). Check that Formulas &gt; Calculation Options is Automatic, then open Copilot from the Copilot button on the Home tab or the floating Copilot icon at the bottom right. Read the About_This_Data sheet before you prompt. The Charts sheet is empty: you will create each chart there with a prompt, in a 2 x 2 grid. The data is on Monthly_Metrics and Source_Summary. Each chart answers one of the four questions below.</w:t>
+        <w:t>Copy BrightPath_Recruitment_Metrics.xlsx from this lab's data folder into a work-c34 folder on your computer and open it in Excel for Microsoft 365 (desktop). Work on this local copy - no OneDrive upload is needed. Check that Formulas &gt; Calculation Options is Automatic, then open Copilot from the Copilot button on the Home tab or the floating Copilot icon at the bottom right. Read the About_This_Data sheet before you prompt. The Charts sheet is empty: you will create each chart there with a prompt, in a 2 x 2 grid. The data is on Monthly_Metrics and Source_Summary. Each chart answers one of the four questions below.</w:t>
       </w:r>
     </w:p>
     <w:p>
@@ -12681,7 +12667,7 @@
         <w:t xml:space="preserve">1.  </w:t>
       </w:r>
       <w:r>
-        <w:t>Go to onedrive.com (or your SharePoint site), open or create the folder work-c34 and select Upload &gt; Files. Upload BrightPath_Client_Orders_Raw.xlsx from this lab's data folder, then open it in Excel for the web or select Open in Desktop App. OneDrive gives you AutoSave and version history (recent Excel builds can also run Copilot on local files). Check that Formulas &gt; Calculation Options is Automatic, then open Copilot from the Copilot button on the Home tab or the floating Copilot icon at the bottom right. Read the About_This_Data sheet before you prompt. Scroll through Orders_Raw and spot three ways the same status or region is written.</w:t>
+        <w:t>Copy BrightPath_Client_Orders_Raw.xlsx from this lab's data folder into a work-c34 folder on your computer and open it in Excel for Microsoft 365 (desktop). Work on this local copy - no OneDrive upload is needed. Check that Formulas &gt; Calculation Options is Automatic, then open Copilot from the Copilot button on the Home tab or the floating Copilot icon at the bottom right. Read the About_This_Data sheet before you prompt. Scroll through Orders_Raw and spot three ways the same status or region is written.</w:t>
       </w:r>
     </w:p>
     <w:p>
@@ -15257,7 +15243,7 @@
         <w:t xml:space="preserve">1.  </w:t>
       </w:r>
       <w:r>
-        <w:t>Go to onedrive.com (or your SharePoint site), open or create the folder work-c34 and select Upload &gt; Files. Upload BrightPath_HR_Outsourcing_Finance.xlsx from this lab's data folder, then open it in Excel for the web or select Open in Desktop App. OneDrive gives you AutoSave and version history (recent Excel builds can also run Copilot on local files). Check that Formulas &gt; Calculation Options is Automatic, then open Copilot from the Copilot button on the Home tab or the floating Copilot icon at the bottom right. Read the About_This_Data sheet before you prompt. Read the Definitions row on About_This_Data - you will hold the finance skill to these.</w:t>
+        <w:t>Copy BrightPath_HR_Outsourcing_Finance.xlsx from this lab's data folder into a work-c34 folder on your computer and open it in Excel for Microsoft 365 (desktop). Work on this local copy - no OneDrive upload is needed. Check that Formulas &gt; Calculation Options is Automatic, then open Copilot from the Copilot button on the Home tab or the floating Copilot icon at the bottom right. Read the About_This_Data sheet before you prompt. Read the Definitions row on About_This_Data - you will hold the finance skill to these.</w:t>
       </w:r>
     </w:p>
     <w:p>
@@ -15355,7 +15341,7 @@
         <w:t xml:space="preserve">2.  </w:t>
       </w:r>
       <w:r>
-        <w:t>Find the skills. In the Copilot pane select Settings (...) &gt; Manage plugins &amp; skills and open each folder. Turn on chart-design (it is off by default), unit-economics and check-model. Close the dialog, type @ in the prompt box and confirm they are listed. A skill that is off can still be called with an @mention.</w:t>
+        <w:t>Turn on the skills. In the Copilot pane select Settings (...) &gt; Manage plugins &amp; skills. Open the Finance folder and turn on unit-economics and check-model. Open the Visualisation folder and turn on chart-design (it is off by default). Leave every other skill as it is. Close the dialog, type @ in the prompt box and confirm all three are listed. theme-design (Step 7) sits in a Formatting folder that is still rolling out - if you have no Formatting folder, skip it; Step 7 shows what to do.</w:t>
       </w:r>
     </w:p>
     <w:p>
@@ -15369,7 +15355,7 @@
           <w:color w:val="0B3060"/>
           <w:sz w:val="19"/>
         </w:rPr>
-        <w:t>Formatting    : brandkit, theme-design</w:t>
+        <w:t>Where         : Settings (...) &gt; Manage plugins &amp; skills - turn on only these</w:t>
       </w:r>
     </w:p>
     <w:p>
@@ -15383,7 +15369,7 @@
           <w:color w:val="0B3060"/>
           <w:sz w:val="19"/>
         </w:rPr>
-        <w:t>Visualization : chart-design</w:t>
+        <w:t>Finance       : unit-economics, check-model</w:t>
       </w:r>
     </w:p>
     <w:p>
@@ -15397,7 +15383,7 @@
           <w:color w:val="0B3060"/>
           <w:sz w:val="19"/>
         </w:rPr>
-        <w:t>Finance       : 3-statements, check-model, comps-analysis, unit-economics and more (20 skills)</w:t>
+        <w:t>Visualisation : chart-design (off by default)</w:t>
       </w:r>
     </w:p>
     <w:p>
@@ -15411,7 +15397,7 @@
           <w:color w:val="0B3060"/>
           <w:sz w:val="19"/>
         </w:rPr>
-        <w:t>Call a skill  : type @ and its name, e.g. @chart-design</w:t>
+        <w:t>Formatting    : theme-design - only if this folder is shown</w:t>
       </w:r>
     </w:p>
     <w:p>
@@ -15425,6 +15411,7 @@
           <w:color w:val="0B3060"/>
           <w:sz w:val="19"/>
         </w:rPr>
+        <w:t>Call a skill  : type @ and its name, e.g. @chart-design</w:t>
       </w:r>
     </w:p>
     <w:p>
@@ -15438,11 +15425,11 @@
           <w:color w:val="0B3060"/>
           <w:sz w:val="19"/>
         </w:rPr>
-        <w:t>CHAT ONLY:</w:t>
-      </w:r>
-    </w:p>
-    <w:p>
-      <w:pPr>
+      </w:r>
+    </w:p>
+    <w:p>
+      <w:pPr>
+        <w:keepNext/>
         <w:keepLines/>
       </w:pPr>
       <w:r>
@@ -15451,27 +15438,11 @@
           <w:color w:val="0B3060"/>
           <w:sz w:val="19"/>
         </w:rPr>
-        <w:t>Which of your skills would help me analyse client acquisition cost and churn in this workbook, and which would help me audit the Headcount_Budget sheet? Do not change anything.</w:t>
-      </w:r>
-    </w:p>
-    <w:p>
-      <w:pPr>
-        <w:spacing w:after="80"/>
-        <w:ind w:left="360"/>
-      </w:pPr>
-      <w:r>
-        <w:rPr>
-          <w:b/>
-        </w:rPr>
-        <w:t xml:space="preserve">3.  </w:t>
-      </w:r>
-      <w:r>
-        <w:t>Call @chart-design (Visualization) in Allow editing. It chooses and formats the chart using the Excel design team's guidance. Check the values: MRR grows from S$238,200 in Jan 2025 to S$482,200 in Jun 2026, with 131 active clients at the end.</w:t>
-      </w:r>
-    </w:p>
-    <w:p>
-      <w:pPr>
-        <w:keepNext/>
+        <w:t>CHAT ONLY:</w:t>
+      </w:r>
+    </w:p>
+    <w:p>
+      <w:pPr>
         <w:keepLines/>
       </w:pPr>
       <w:r>
@@ -15480,7 +15451,22 @@
           <w:color w:val="0B3060"/>
           <w:sz w:val="19"/>
         </w:rPr>
-        <w:t>ALLOW EDITING:</w:t>
+        <w:t>Which of your skills would help me analyse client acquisition cost and churn in this workbook, and which would help me audit the Headcount_Budget sheet? Do not change anything.</w:t>
+      </w:r>
+    </w:p>
+    <w:p>
+      <w:pPr>
+        <w:spacing w:after="80"/>
+        <w:ind w:left="360"/>
+      </w:pPr>
+      <w:r>
+        <w:rPr>
+          <w:b/>
+        </w:rPr>
+        <w:t xml:space="preserve">3.  </w:t>
+      </w:r>
+      <w:r>
+        <w:t>Call @chart-design (Visualisation) in Allow editing. It chooses and formats the chart using the Excel design team's guidance. Check the values: MRR grows from S$238,200 in Jan 2025 to S$482,200 in Jun 2026, with 131 active clients at the end.</w:t>
       </w:r>
     </w:p>
     <w:p>
@@ -15494,7 +15480,7 @@
           <w:color w:val="0B3060"/>
           <w:sz w:val="19"/>
         </w:rPr>
-        <w:t>@chart-design Create a combo chart on a new sheet Charts from tblClientMonths: MRR as columns and Clients_End as a line on a secondary axis, Jan 2025 to Jun 2026.</w:t>
+        <w:t>ALLOW EDITING:</w:t>
       </w:r>
     </w:p>
     <w:p>
@@ -15508,6 +15494,7 @@
           <w:color w:val="0B3060"/>
           <w:sz w:val="19"/>
         </w:rPr>
+        <w:t>@chart-design Create a combo chart on a new sheet Charts from tblClientMonths: MRR as columns and Clients_End as a line on a secondary axis, Jan 2025 to Jun 2026.</w:t>
       </w:r>
     </w:p>
     <w:p>
@@ -15521,11 +15508,11 @@
           <w:color w:val="0B3060"/>
           <w:sz w:val="19"/>
         </w:rPr>
-        <w:t>FOLLOW-UP:</w:t>
-      </w:r>
-    </w:p>
-    <w:p>
-      <w:pPr>
+      </w:r>
+    </w:p>
+    <w:p>
+      <w:pPr>
+        <w:keepNext/>
         <w:keepLines/>
       </w:pPr>
       <w:r>
@@ -15534,27 +15521,11 @@
           <w:color w:val="0B3060"/>
           <w:sz w:val="19"/>
         </w:rPr>
-        <w:t>@chart-design Improve this chart for a leadership slide: a title that states the finding, axis titles with units, and a data label on the last month only.</w:t>
-      </w:r>
-    </w:p>
-    <w:p>
-      <w:pPr>
-        <w:spacing w:after="80"/>
-        <w:ind w:left="360"/>
-      </w:pPr>
-      <w:r>
-        <w:rPr>
-          <w:b/>
-        </w:rPr>
-        <w:t xml:space="preserve">4.  </w:t>
-      </w:r>
-      <w:r>
-        <w:t>Call the finance skill @unit-economics in Plan mode, so you can review its approach before it builds. Check that the plan uses H1 2026 and the About_This_Data definitions; reply with corrections if not, then approve and select Done.</w:t>
-      </w:r>
-    </w:p>
-    <w:p>
-      <w:pPr>
-        <w:keepNext/>
+        <w:t>FOLLOW-UP:</w:t>
+      </w:r>
+    </w:p>
+    <w:p>
+      <w:pPr>
         <w:keepLines/>
       </w:pPr>
       <w:r>
@@ -15563,11 +15534,27 @@
           <w:color w:val="0B3060"/>
           <w:sz w:val="19"/>
         </w:rPr>
-        <w:t>PLAN MODE:</w:t>
-      </w:r>
-    </w:p>
-    <w:p>
-      <w:pPr>
+        <w:t>@chart-design Improve this chart for a leadership slide: a title that states the finding, axis titles with units, and a data label on the last month only.</w:t>
+      </w:r>
+    </w:p>
+    <w:p>
+      <w:pPr>
+        <w:spacing w:after="80"/>
+        <w:ind w:left="360"/>
+      </w:pPr>
+      <w:r>
+        <w:rPr>
+          <w:b/>
+        </w:rPr>
+        <w:t xml:space="preserve">4.  </w:t>
+      </w:r>
+      <w:r>
+        <w:t>Call the finance skill @unit-economics in Plan mode, so you can review its approach before it builds. Check that the plan uses H1 2026 and the About_This_Data definitions; reply with corrections if not, then approve and select Done.</w:t>
+      </w:r>
+    </w:p>
+    <w:p>
+      <w:pPr>
+        <w:keepNext/>
         <w:keepLines/>
       </w:pPr>
       <w:r>
@@ -15576,27 +15563,11 @@
           <w:color w:val="0B3060"/>
           <w:sz w:val="19"/>
         </w:rPr>
-        <w:t>@unit-economics Analyse the unit economics of BrightPath's HR-outsourcing clients for H1 2026 using tblClientMonths, tblClients and tblSpend. Use the definitions on About_This_Data. Put the results on a new sheet Unit_Economics: CAC, ARPA, gross margin, monthly churn, LTV, LTV:CAC and payback months, plus CAC by Channel. List your assumptions.</w:t>
-      </w:r>
-    </w:p>
-    <w:p>
-      <w:pPr>
-        <w:spacing w:after="80"/>
-        <w:ind w:left="360"/>
-      </w:pPr>
-      <w:r>
-        <w:rPr>
-          <w:b/>
-        </w:rPr>
-        <w:t xml:space="preserve">5.  </w:t>
-      </w:r>
-      <w:r>
-        <w:t>Never trust a skill's numbers without a check. Ask Copilot to add these independent formulas, then compare them with the Unit_Economics sheet. If they differ, ask the skill to show its calculation and use the definition.</w:t>
-      </w:r>
-    </w:p>
-    <w:p>
-      <w:pPr>
-        <w:keepNext/>
+        <w:t>PLAN MODE:</w:t>
+      </w:r>
+    </w:p>
+    <w:p>
+      <w:pPr>
         <w:keepLines/>
       </w:pPr>
       <w:r>
@@ -15605,7 +15576,22 @@
           <w:color w:val="0B3060"/>
           <w:sz w:val="19"/>
         </w:rPr>
-        <w:t>CHECK (Allow editing):</w:t>
+        <w:t>@unit-economics Analyse the unit economics of BrightPath's HR-outsourcing clients for H1 2026 using tblClientMonths, tblClients and tblSpend. Use the definitions on About_This_Data. Put the results on a new sheet Unit_Economics: CAC, ARPA, gross margin, monthly churn, LTV, LTV:CAC and payback months, plus CAC by Channel. List your assumptions.</w:t>
+      </w:r>
+    </w:p>
+    <w:p>
+      <w:pPr>
+        <w:spacing w:after="80"/>
+        <w:ind w:left="360"/>
+      </w:pPr>
+      <w:r>
+        <w:rPr>
+          <w:b/>
+        </w:rPr>
+        <w:t xml:space="preserve">5.  </w:t>
+      </w:r>
+      <w:r>
+        <w:t>Never trust a skill's numbers without a check. Ask Copilot to add these independent formulas, then compare them with the Unit_Economics sheet. If they differ, ask the skill to show its calculation and use the definition.</w:t>
       </w:r>
     </w:p>
     <w:p>
@@ -15619,7 +15605,7 @@
           <w:color w:val="0B3060"/>
           <w:sz w:val="19"/>
         </w:rPr>
-        <w:t>Create a sheet named Checks. Enter these labels and formulas exactly as written, then tell me each result:</w:t>
+        <w:t>CHECK (Allow editing):</w:t>
       </w:r>
     </w:p>
     <w:p>
@@ -15633,7 +15619,7 @@
           <w:color w:val="0B3060"/>
           <w:sz w:val="19"/>
         </w:rPr>
-        <w:t>A1 New clients H1      B1 =SUMIFS(tblClientMonths[New_Clients],tblClientMonths[Month],"&gt;="&amp;DATE(2026,1,1))</w:t>
+        <w:t>Create a sheet named Checks. Enter these labels and formulas exactly as written, then tell me each result:</w:t>
       </w:r>
     </w:p>
     <w:p>
@@ -15647,7 +15633,7 @@
           <w:color w:val="0B3060"/>
           <w:sz w:val="19"/>
         </w:rPr>
-        <w:t>A2 S&amp;M spend H1        B2 =SUMIFS(tblClientMonths[Sales_Marketing_Spend],tblClientMonths[Month],"&gt;="&amp;DATE(2026,1,1))</w:t>
+        <w:t>A1 New clients H1      B1 =SUMIFS(tblClientMonths[New_Clients],tblClientMonths[Month],"&gt;="&amp;DATE(2026,1,1))</w:t>
       </w:r>
     </w:p>
     <w:p>
@@ -15661,7 +15647,7 @@
           <w:color w:val="0B3060"/>
           <w:sz w:val="19"/>
         </w:rPr>
-        <w:t>A3 CAC                 B3 =B2/B1</w:t>
+        <w:t>A2 S&amp;M spend H1        B2 =SUMIFS(tblClientMonths[Sales_Marketing_Spend],tblClientMonths[Month],"&gt;="&amp;DATE(2026,1,1))</w:t>
       </w:r>
     </w:p>
     <w:p>
@@ -15675,7 +15661,7 @@
           <w:color w:val="0B3060"/>
           <w:sz w:val="19"/>
         </w:rPr>
-        <w:t>A4 ARPA                B4 =INDEX(tblClientMonths[MRR],18)/INDEX(tblClientMonths[Clients_End],18)</w:t>
+        <w:t>A3 CAC                 B3 =B2/B1</w:t>
       </w:r>
     </w:p>
     <w:p>
@@ -15689,7 +15675,7 @@
           <w:color w:val="0B3060"/>
           <w:sz w:val="19"/>
         </w:rPr>
-        <w:t>A5 Gross margin        B5 =AVERAGEIFS(tblClientMonths[Gross_Margin_Pct],tblClientMonths[Month],"&gt;="&amp;DATE(2026,1,1))</w:t>
+        <w:t>A4 ARPA                B4 =INDEX(tblClientMonths[MRR],18)/INDEX(tblClientMonths[Clients_End],18)</w:t>
       </w:r>
     </w:p>
     <w:p>
@@ -15703,7 +15689,7 @@
           <w:color w:val="0B3060"/>
           <w:sz w:val="19"/>
         </w:rPr>
-        <w:t>A6 Monthly churn       B6 =AVERAGE(FILTER(tblClientMonths[Churned_Clients]/tblClientMonths[Clients_Start],tblClientMonths[Month]&gt;=DATE(2026,1,1)))</w:t>
+        <w:t>A5 Gross margin        B5 =AVERAGEIFS(tblClientMonths[Gross_Margin_Pct],tblClientMonths[Month],"&gt;="&amp;DATE(2026,1,1))</w:t>
       </w:r>
     </w:p>
     <w:p>
@@ -15717,7 +15703,7 @@
           <w:color w:val="0B3060"/>
           <w:sz w:val="19"/>
         </w:rPr>
-        <w:t>A7 LTV                 B7 =B4*B5/B6</w:t>
+        <w:t>A6 Monthly churn       B6 =AVERAGE(FILTER(tblClientMonths[Churned_Clients]/tblClientMonths[Clients_Start],tblClientMonths[Month]&gt;=DATE(2026,1,1)))</w:t>
       </w:r>
     </w:p>
     <w:p>
@@ -15731,7 +15717,7 @@
           <w:color w:val="0B3060"/>
           <w:sz w:val="19"/>
         </w:rPr>
-        <w:t>A8 LTV to CAC          B8 =B7/B3</w:t>
+        <w:t>A7 LTV                 B7 =B4*B5/B6</w:t>
       </w:r>
     </w:p>
     <w:p>
@@ -15745,7 +15731,7 @@
           <w:color w:val="0B3060"/>
           <w:sz w:val="19"/>
         </w:rPr>
-        <w:t>A9 Payback months      B9 =B3/(B4*B5)</w:t>
+        <w:t>A8 LTV to CAC          B8 =B7/B3</w:t>
       </w:r>
     </w:p>
     <w:p>
@@ -15759,6 +15745,7 @@
           <w:color w:val="0B3060"/>
           <w:sz w:val="19"/>
         </w:rPr>
+        <w:t>A9 Payback months      B9 =B3/(B4*B5)</w:t>
       </w:r>
     </w:p>
     <w:p>
@@ -15772,11 +15759,11 @@
           <w:color w:val="0B3060"/>
           <w:sz w:val="19"/>
         </w:rPr>
-        <w:t>FOLLOW-UP:</w:t>
-      </w:r>
-    </w:p>
-    <w:p>
-      <w:pPr>
+      </w:r>
+    </w:p>
+    <w:p>
+      <w:pPr>
+        <w:keepNext/>
         <w:keepLines/>
       </w:pPr>
       <w:r>
@@ -15785,27 +15772,11 @@
           <w:color w:val="0B3060"/>
           <w:sz w:val="19"/>
         </w:rPr>
-        <w:t>Compare Checks!B3:B9 with the Unit_Economics sheet. Show any value that differs and why.</w:t>
-      </w:r>
-    </w:p>
-    <w:p>
-      <w:pPr>
-        <w:spacing w:after="80"/>
-        <w:ind w:left="360"/>
-      </w:pPr>
-      <w:r>
-        <w:rPr>
-          <w:b/>
-        </w:rPr>
-        <w:t xml:space="preserve">6.  </w:t>
-      </w:r>
-      <w:r>
-        <w:t>Audit a model with @check-model. Ask for the findings first in Chat only, read them, then switch to Allow editing and ask for the fixes. It should find three problems: a typed number in E3, an 11-month formula in E6 and a total in E10 that misses the last role.</w:t>
-      </w:r>
-    </w:p>
-    <w:p>
-      <w:pPr>
-        <w:keepNext/>
+        <w:t>FOLLOW-UP:</w:t>
+      </w:r>
+    </w:p>
+    <w:p>
+      <w:pPr>
         <w:keepLines/>
       </w:pPr>
       <w:r>
@@ -15814,7 +15785,22 @@
           <w:color w:val="0B3060"/>
           <w:sz w:val="19"/>
         </w:rPr>
-        <w:t>CHAT ONLY:</w:t>
+        <w:t>Compare Checks!B3:B9 with the Unit_Economics sheet. Show any value that differs and why.</w:t>
+      </w:r>
+    </w:p>
+    <w:p>
+      <w:pPr>
+        <w:spacing w:after="80"/>
+        <w:ind w:left="360"/>
+      </w:pPr>
+      <w:r>
+        <w:rPr>
+          <w:b/>
+        </w:rPr>
+        <w:t xml:space="preserve">6.  </w:t>
+      </w:r>
+      <w:r>
+        <w:t>Audit a model with @check-model. Ask for the findings first in Chat only, read them, then switch to Allow editing and ask for the fixes. It should find three problems: a typed number in E3, an 11-month formula in E6 and a total in E10 that misses the last role.</w:t>
       </w:r>
     </w:p>
     <w:p>
@@ -15828,7 +15814,7 @@
           <w:color w:val="0B3060"/>
           <w:sz w:val="19"/>
         </w:rPr>
-        <w:t>@check-model Audit the Headcount_Budget sheet: look for typed numbers in formula columns, formulas that differ from their neighbours, and totals that miss rows. List each issue with its cell, what is wrong and the fix. Do not change anything yet.</w:t>
+        <w:t>CHAT ONLY:</w:t>
       </w:r>
     </w:p>
     <w:p>
@@ -15842,6 +15828,7 @@
           <w:color w:val="0B3060"/>
           <w:sz w:val="19"/>
         </w:rPr>
+        <w:t>@check-model Audit the Headcount_Budget sheet: look for typed numbers in formula columns, formulas that differ from their neighbours, and totals that miss rows. List each issue with its cell, what is wrong and the fix. Do not change anything yet.</w:t>
       </w:r>
     </w:p>
     <w:p>
@@ -15855,11 +15842,11 @@
           <w:color w:val="0B3060"/>
           <w:sz w:val="19"/>
         </w:rPr>
-        <w:t>ALLOW EDITING:</w:t>
-      </w:r>
-    </w:p>
-    <w:p>
-      <w:pPr>
+      </w:r>
+    </w:p>
+    <w:p>
+      <w:pPr>
+        <w:keepNext/>
         <w:keepLines/>
       </w:pPr>
       <w:r>
@@ -15868,6 +15855,19 @@
           <w:color w:val="0B3060"/>
           <w:sz w:val="19"/>
         </w:rPr>
+        <w:t>ALLOW EDITING:</w:t>
+      </w:r>
+    </w:p>
+    <w:p>
+      <w:pPr>
+        <w:keepLines/>
+      </w:pPr>
+      <w:r>
+        <w:rPr>
+          <w:rFonts w:ascii="Consolas" w:hAnsi="Consolas"/>
+          <w:color w:val="0B3060"/>
+          <w:sz w:val="19"/>
+        </w:rPr>
         <w:t>Fix the issues you found on Headcount_Budget and tell me the new Total FY2027 cost.</w:t>
       </w:r>
     </w:p>
@@ -15883,7 +15883,7 @@
         <w:t xml:space="preserve">7.  </w:t>
       </w:r>
       <w:r>
-        <w:t>Style the workbook with @theme-design (Formatting). It applies one coordinated theme to cells, tables and charts. If your organisation has set up a brand kit, try @brandkit instead. Then log your prompts.</w:t>
+        <w:t>Style the workbook with @theme-design (Formatting). It applies one coordinated theme to cells, tables and charts. If theme-design is not in your @ list, your account does not have it yet: delete @theme-design and run the rest of the prompt as it is. If your organisation has set up a brand kit, try @brandkit instead. Then log your prompts.</w:t>
       </w:r>
     </w:p>
     <w:p>
@@ -16644,7 +16644,7 @@
         <w:keepNext/>
       </w:pPr>
       <w:r>
-        <w:t>Keep the workbook in work-c34. Lab 6 needs your OneDrive, because custom skills are stored there.</w:t>
+        <w:t>Keep the workbook in work-c34. Lab 6 needs your OneDrive for one thing only: custom skills are stored there.</w:t>
       </w:r>
     </w:p>
     <w:p>
@@ -17679,7 +17679,7 @@
         <w:t xml:space="preserve">1.  </w:t>
       </w:r>
       <w:r>
-        <w:t>Go to onedrive.com (or your SharePoint site), open or create the folder work-c34 and select Upload &gt; Files. Upload BrightPath_Interview_Schedule.xlsx from this lab's data folder, then open it in Excel for the web or select Open in Desktop App. OneDrive gives you AutoSave and version history (recent Excel builds can also run Copilot on local files). Check that Formulas &gt; Calculation Options is Automatic, then open Copilot from the Copilot button on the Home tab or the floating Copilot icon at the bottom right. Read the About_This_Data sheet before you prompt. For this lab the OneDrive copy matters: Copilot finds custom skills in your OneDrive.</w:t>
+        <w:t>Copy BrightPath_Interview_Schedule.xlsx from this lab's data folder into a work-c34 folder on your computer and open it in Excel for Microsoft 365 (desktop). Work on this local copy - no OneDrive upload is needed. Check that Formulas &gt; Calculation Options is Automatic, then open Copilot from the Copilot button on the Home tab or the floating Copilot icon at the bottom right. Read the About_This_Data sheet before you prompt. The workbook stays local; only the skill file goes in OneDrive (Step 2).</w:t>
       </w:r>
     </w:p>
     <w:p>
@@ -17749,7 +17749,7 @@
         <w:t xml:space="preserve">2.  </w:t>
       </w:r>
       <w:r>
-        <w:t>Create your skills folder. In the Copilot pane select Settings (...) &gt; Manage plugins &amp; skills &gt; Custom skills &gt; Create OneDrive folder, then Open skills folder. OneDrive opens a folder named skills, usually under Documents &gt; Copilot &gt; Microsoft Excel. Open the sample calendar skill folder (e.g. make-calendar.example) and read its SKILL.md: a front matter block between --- lines, then plain-English steps.</w:t>
+        <w:t>Create your skills folder. In the Copilot pane select Settings (...) &gt; Manage plugins &amp; skills &gt; Custom skills and turn the Custom skills switch on. Then select Add in OneDrive (in some versions: Create OneDrive folder, then Open skills folder). OneDrive opens a folder named skills, usually under Documents &gt; Copilot &gt; Microsoft Excel. Open the sample calendar skill folder (e.g. make-calendar.example) and read its SKILL.md: a front matter block between --- lines, then plain-English steps.</w:t>
       </w:r>
     </w:p>
     <w:p>
@@ -18085,7 +18085,7 @@
         <w:t xml:space="preserve">5.  </w:t>
       </w:r>
       <w:r>
-        <w:t>Make Excel see the new skill: Settings (...) &gt; Manage plugins &amp; skills &gt; Custom skills &gt; Refresh, then turn interview-calendar on. Close the dialog and type @inter in the prompt box - the skill should appear.</w:t>
+        <w:t>Make Excel see the new skill: Settings (...) &gt; Manage plugins &amp; skills &gt; Custom skills, check the Custom skills switch is on and select Refresh (the round arrow). Wait until the list loads, then turn interview-calendar on. Close the dialog and type @inter in the prompt box - the skill should appear.</w:t>
       </w:r>
     </w:p>
     <w:p>
@@ -18100,7 +18100,7 @@
         <w:t xml:space="preserve">6.  </w:t>
       </w:r>
       <w:r>
-        <w:t>Run the skill in Allow editing with a one-line prompt. When it finishes, inspect the calendar and select Done. Then ask Copilot to add the check formula and compare it with the number of interviews on the calendar.</w:t>
+        <w:t>Run the skill in Allow editing with a one-line prompt. First check that the title bar shows BrightPath_Interview_Schedule: the skill is available in every workbook, but it only works where tblInterviews exists. When it finishes, inspect the calendar and select Done. Then ask Copilot to add the check formula and compare it with the number of interviews on the calendar.</w:t>
       </w:r>
     </w:p>
     <w:p>
@@ -19087,7 +19087,7 @@
               <w:rPr>
                 <w:sz w:val="19"/>
               </w:rPr>
-              <w:t>There is no Create OneDrive folder button.</w:t>
+              <w:t>There is no Add in OneDrive or Create OneDrive folder button.</w:t>
             </w:r>
           </w:p>
         </w:tc>
@@ -19105,6 +19105,45 @@
                 <w:sz w:val="19"/>
               </w:rPr>
               <w:t>Custom skills are rolling out and depend on your licence and update channel. Use the ready-made SKILL.md to read the format, and run the same steps as a normal prompt instead.</w:t>
+            </w:r>
+          </w:p>
+        </w:tc>
+      </w:tr>
+      <w:tr>
+        <w:trPr>
+          <w:cantSplit/>
+        </w:trPr>
+        <w:tc>
+          <w:tcPr>
+            <w:tcW w:type="dxa" w:w="4320"/>
+          </w:tcPr>
+          <w:p>
+            <w:pPr>
+              <w:keepNext/>
+            </w:pPr>
+            <w:r/>
+            <w:r>
+              <w:rPr>
+                <w:sz w:val="19"/>
+              </w:rPr>
+              <w:t>Copilot says tblInterviews is not present in this workbook.</w:t>
+            </w:r>
+          </w:p>
+        </w:tc>
+        <w:tc>
+          <w:tcPr>
+            <w:tcW w:type="dxa" w:w="4320"/>
+          </w:tcPr>
+          <w:p>
+            <w:pPr>
+              <w:keepNext/>
+            </w:pPr>
+            <w:r/>
+            <w:r>
+              <w:rPr>
+                <w:sz w:val="19"/>
+              </w:rPr>
+              <w:t>The skill ran in another lab's workbook. Open BrightPath_Interview_Schedule.xlsx and send the prompt again from its Copilot pane.</w:t>
             </w:r>
           </w:p>
         </w:tc>
@@ -20602,7 +20641,7 @@
         <w:t xml:space="preserve">1.  </w:t>
       </w:r>
       <w:r>
-        <w:t>Go to onedrive.com (or your SharePoint site), open or create the folder work-c34 and select Upload &gt; Files. Upload BrightPath_Recruitment_Dashboard_Data.xlsx from this lab's data folder, then open it in Excel for the web or select Open in Desktop App. OneDrive gives you AutoSave and version history (recent Excel builds can also run Copilot on local files). Check that Formulas &gt; Calculation Options is Automatic, then open Copilot from the Copilot button on the Home tab or the floating Copilot icon at the bottom right. Read the About_This_Data sheet before you prompt. Read the KPI definitions on About_This_Data - they go into the rules next.</w:t>
+        <w:t>Copy BrightPath_Recruitment_Dashboard_Data.xlsx from this lab's data folder into a work-c34 folder on your computer and open it in Excel for Microsoft 365 (desktop). Work on this local copy - no OneDrive upload is needed. Check that Formulas &gt; Calculation Options is Automatic, then open Copilot from the Copilot button on the Home tab or the floating Copilot icon at the bottom right. Read the About_This_Data sheet before you prompt. Read the KPI definitions on About_This_Data - they go into the rules next.</w:t>
       </w:r>
     </w:p>
     <w:p>
@@ -23606,7 +23645,7 @@
         <w:t xml:space="preserve">1.  </w:t>
       </w:r>
       <w:r>
-        <w:t>Go to onedrive.com (or your SharePoint site), open or create the folder work-c34 and select Upload &gt; Files. Upload BrightPath_Workforce_Headcount.xlsx from this lab's data folder, then open it in Excel for the web or select Open in Desktop App. OneDrive gives you AutoSave and version history (recent Excel builds can also run Copilot on local files). Check that Formulas &gt; Calculation Options is Automatic, then open Copilot from the Copilot button on the Home tab or the floating Copilot icon at the bottom right. Read the About_This_Data sheet before you prompt. Do not touch the New_Joiners_Jul2026 sheet until the refresh test.</w:t>
+        <w:t>Copy BrightPath_Workforce_Headcount.xlsx from this lab's data folder into a work-c34 folder on your computer and open it in Excel for Microsoft 365 (desktop). Work on this local copy - no OneDrive upload is needed. Check that Formulas &gt; Calculation Options is Automatic, then open Copilot from the Copilot button on the Home tab or the floating Copilot icon at the bottom right. Read the About_This_Data sheet before you prompt. Do not touch the New_Joiners_Jul2026 sheet until the refresh test.</w:t>
       </w:r>
     </w:p>
     <w:p>

</xml_diff>

<commit_message>
Update Lab 8 skill creation to Microsoft 365 Copilot web
</commit_message>
<xml_diff>
--- a/courseware/LG-Microsoft 365 Copilot for Excel.docx
+++ b/courseware/LG-Microsoft 365 Copilot for Excel.docx
@@ -179,7 +179,7 @@
           <w:color w:val="1F6FEB"/>
           <w:sz w:val="24"/>
         </w:rPr>
-        <w:t>Version 3.0</w:t>
+        <w:t>Version 3.1</w:t>
       </w:r>
     </w:p>
     <w:p>
@@ -295,6 +295,64 @@
               <w:rPr>
                 <w:sz w:val="19"/>
               </w:rPr>
+              <w:t>3.1</w:t>
+            </w:r>
+          </w:p>
+        </w:tc>
+        <w:tc>
+          <w:tcPr>
+            <w:tcW w:type="dxa" w:w="1656"/>
+          </w:tcPr>
+          <w:p>
+            <w:r/>
+            <w:r>
+              <w:rPr>
+                <w:sz w:val="19"/>
+              </w:rPr>
+              <w:t>12 October 2026</w:t>
+            </w:r>
+          </w:p>
+        </w:tc>
+        <w:tc>
+          <w:tcPr>
+            <w:tcW w:type="dxa" w:w="4896"/>
+          </w:tcPr>
+          <w:p>
+            <w:r/>
+            <w:r>
+              <w:rPr>
+                <w:sz w:val="19"/>
+              </w:rPr>
+              <w:t>Lab 8 skill drafting moved to Microsoft 365 Copilot on the web; self-contained creation prompt, web-to-OneDrive-to-Excel handoff, prompt page and learner materials aligned.</w:t>
+            </w:r>
+          </w:p>
+        </w:tc>
+        <w:tc>
+          <w:tcPr>
+            <w:tcW w:type="dxa" w:w="1656"/>
+          </w:tcPr>
+          <w:p>
+            <w:r/>
+            <w:r>
+              <w:rPr>
+                <w:sz w:val="19"/>
+              </w:rPr>
+              <w:t>Assigned Tertiary Infotech Academy Trainer</w:t>
+            </w:r>
+          </w:p>
+        </w:tc>
+      </w:tr>
+      <w:tr>
+        <w:tc>
+          <w:tcPr>
+            <w:tcW w:type="dxa" w:w="1152"/>
+          </w:tcPr>
+          <w:p>
+            <w:r/>
+            <w:r>
+              <w:rPr>
+                <w:sz w:val="19"/>
+              </w:rPr>
               <w:t>1.0</w:t>
             </w:r>
           </w:p>
@@ -1426,7 +1484,7 @@
         </w:rPr>
         <w:t>Topic 03 Recap - Mapped to Learning Outcomes</w:t>
         <w:tab/>
-        <w:t>90</w:t>
+        <w:t>91</w:t>
       </w:r>
     </w:p>
     <w:p>
@@ -1445,7 +1503,7 @@
         </w:rPr>
         <w:t>Wrap-Up - The Complete C34 Workflow</w:t>
         <w:tab/>
-        <w:t>90</w:t>
+        <w:t>91</w:t>
       </w:r>
     </w:p>
     <w:p>
@@ -1464,7 +1522,7 @@
         </w:rPr>
         <w:t>Next Steps</w:t>
         <w:tab/>
-        <w:t>92</w:t>
+        <w:t>93</w:t>
       </w:r>
     </w:p>
     <w:p>
@@ -1483,7 +1541,7 @@
         </w:rPr>
         <w:t>Glossary</w:t>
         <w:tab/>
-        <w:t>92</w:t>
+        <w:t>93</w:t>
       </w:r>
     </w:p>
     <w:p>
@@ -24902,7 +24960,7 @@
         <w:keepNext/>
       </w:pPr>
       <w:r>
-        <w:t>BrightPath's HR Director needs the same kind of dashboard every month. Instead of repeating a long brief, you will ask Copilot to write an hr-workforce-dashboard skill, save it to OneDrive and run it on the workforce workbook, whose .Rules sheet holds the period, the attrition definition and the privacy rule. Then you will append eight July joiners and refresh to prove the dashboard is live, check that no slicer combination exposes fewer than 5 people, and ask Copilot for a short leadership summary.</w:t>
+        <w:t>BrightPath's HR Director needs the same kind of dashboard every month. Instead of repeating a long brief, you will ask Microsoft 365 Copilot at https://copilot.cloud.microsoft/ to write an hr-workforce-dashboard skill, save it to OneDrive and return to Excel to run it on the workforce workbook, whose .Rules sheet holds the period, the attrition definition and the privacy rule. Then you will append eight July joiners and refresh to prove the dashboard is live, check that no slicer combination exposes fewer than 5 people, and ask Copilot for a short leadership summary.</w:t>
       </w:r>
     </w:p>
     <w:p>
@@ -24923,7 +24981,7 @@
         <w:keepNext/>
       </w:pPr>
       <w:r>
-        <w:t>An hr-workforce-dashboard skill in OneDrive, and BrightPath_Workforce_Headcount.xlsx with a .Rules sheet, helper columns, a Checks sheet and an HR_Dashboard with six KPI cards, four charts and Location and Job_Level slicers - refresh-tested and privacy-checked   (Tools: Excel · Copilot (Chat only, Plan, Allow editing) · .Rules · custom skill · PivotTables, slicers, refresh.)</w:t>
+        <w:t>An hr-workforce-dashboard skill in OneDrive, and BrightPath_Workforce_Headcount.xlsx with a .Rules sheet, helper columns, a Checks sheet and an HR_Dashboard with six KPI cards, four charts and Location and Job_Level slicers - refresh-tested and privacy-checked   (Tools: Microsoft 365 Copilot web (https://copilot.cloud.microsoft/) to draft the skill · Excel Copilot to run it · .Rules · PivotTables, slicers, refresh.)</w:t>
       </w:r>
     </w:p>
     <w:p>
@@ -24957,6 +25015,14 @@
     </w:p>
     <w:p>
       <w:pPr>
+        <w:pStyle w:val="ListBullet"/>
+      </w:pPr>
+      <w:r>
+        <w:t>Access to https://copilot.cloud.microsoft/ with the same work account used in Excel and OneDrive.</w:t>
+      </w:r>
+    </w:p>
+    <w:p>
+      <w:pPr>
         <w:keepNext/>
       </w:pPr>
       <w:r>
@@ -25288,7 +25354,7 @@
         <w:t xml:space="preserve">3.  </w:t>
       </w:r>
       <w:r>
-        <w:t>Let Copilot write the skill. In Chat only, describe the recipe you followed in Lab 7, made general. Read the reply and ask for changes until the steps are clear.</w:t>
+        <w:t>Open https://copilot.cloud.microsoft/ in your browser and sign in with the same work account used in Excel. Start a new chat in Microsoft 365 Copilot on the web and paste Prompt B below to draft the skill. The web chat does not automatically see your local workbook or Excel chat, so this prompt supplies the table schema and dashboard recipe. No workbook upload is needed. Read the returned text: it must start with --- and include name: hr-workforce-dashboard and a description, followed by the numbered steps. Ask for corrections in this web chat before saving.</w:t>
       </w:r>
     </w:p>
     <w:p>
@@ -25302,7 +25368,7 @@
           <w:color w:val="0B3060"/>
           <w:sz w:val="19"/>
         </w:rPr>
-        <w:t>CHAT ONLY:</w:t>
+        <w:t>PROMPT (Microsoft 365 Copilot web):</w:t>
       </w:r>
     </w:p>
     <w:p>
@@ -25330,7 +25396,7 @@
           <w:color w:val="0B3060"/>
           <w:sz w:val="19"/>
         </w:rPr>
-        <w:t>Description: Use when I ask for a workforce, headcount or attrition dashboard from an employee table.</w:t>
+        <w:t>Return reusable skill instructions; do not build a dashboard or claim to inspect my local workbook in this chat.</w:t>
       </w:r>
     </w:p>
     <w:p>
@@ -25344,7 +25410,7 @@
           <w:color w:val="0B3060"/>
           <w:sz w:val="19"/>
         </w:rPr>
-        <w:t>Steps:</w:t>
+        <w:t>Start with YAML front matter containing name: hr-workforce-dashboard and a description.</w:t>
       </w:r>
     </w:p>
     <w:p>
@@ -25358,7 +25424,7 @@
           <w:color w:val="0B3060"/>
           <w:sz w:val="19"/>
         </w:rPr>
-        <w:t>1) Read the .Rules sheet first and follow it.</w:t>
+        <w:t>Description: Use when I ask for a workforce, headcount or attrition dashboard from an employee table.</w:t>
       </w:r>
     </w:p>
     <w:p>
@@ -25372,7 +25438,7 @@
           <w:color w:val="0B3060"/>
           <w:sz w:val="19"/>
         </w:rPr>
-        <w:t>2) Add helper columns Active_Start, Exit_In_Period and Tenure_Years using the period in the rules.</w:t>
+        <w:t>Workbook context for the skill when it runs in Excel: tblEmployees has Employee_ID, Department, Location, Job_Level, Employment_Type, Hire_Date, Exit_Date, Exit_Type, Status, Monthly_Salary, Engagement_Score, and Training_Hours_YTD. Status is Active or Exited; blank Exit_Date means no recorded exit.</w:t>
       </w:r>
     </w:p>
     <w:p>
@@ -25386,7 +25452,7 @@
           <w:color w:val="0B3060"/>
           <w:sz w:val="19"/>
         </w:rPr>
-        <w:t>3) Create a Checks sheet with independent COUNTIFS formulas for active headcount (Status Active), headcount at period start, headcount at period end, exits, voluntary exits, attrition rate and hires.</w:t>
+        <w:t>The .Rules worksheet holds the reporting period (2025-07-01 to 2026-06-30 for this lab), KPI definitions, privacy limits and formatting. Read it at run time; ask if it is missing or unclear.</w:t>
       </w:r>
     </w:p>
     <w:p>
@@ -25400,7 +25466,7 @@
           <w:color w:val="0B3060"/>
           <w:sz w:val="19"/>
         </w:rPr>
-        <w:t>4) Put all PivotTables on Dash_Data.</w:t>
+        <w:t>Attrition = exits in period / ((headcount at period start + headcount at period end) / 2).</w:t>
       </w:r>
     </w:p>
     <w:p>
@@ -25414,7 +25480,7 @@
           <w:color w:val="0B3060"/>
           <w:sz w:val="19"/>
         </w:rPr>
-        <w:t>5) Build HR_Dashboard: six KPI cards (Active headcount, Exits, Attrition rate, Voluntary attrition rate,</w:t>
+        <w:t>Voluntary attrition uses voluntary exits and the same denominator; handle a zero denominator explicitly.</w:t>
       </w:r>
     </w:p>
     <w:p>
@@ -25428,7 +25494,7 @@
           <w:color w:val="0B3060"/>
           <w:sz w:val="19"/>
         </w:rPr>
-        <w:t xml:space="preserve">   Avg tenure of active staff, Hires), charts of headcount by Department, attrition rate by Department, hires vs exits by quarter and headcount by Location, and slicers for Location and Job_Level.</w:t>
+        <w:t>Never display Employee_ID, salary, individual records or groups smaller than 5 on the dashboard.</w:t>
       </w:r>
     </w:p>
     <w:p>
@@ -25442,7 +25508,7 @@
           <w:color w:val="0B3060"/>
           <w:sz w:val="19"/>
         </w:rPr>
-        <w:t>6) Compare every KPI card with Checks and report any difference.</w:t>
+        <w:t>Steps:</w:t>
       </w:r>
     </w:p>
     <w:p>
@@ -25456,11 +25522,12 @@
           <w:color w:val="0B3060"/>
           <w:sz w:val="19"/>
         </w:rPr>
-        <w:t>7) List any slicer combination with fewer than 5 employees.</w:t>
-      </w:r>
-    </w:p>
-    <w:p>
-      <w:pPr>
+        <w:t>1) Read the .Rules sheet first and follow it.</w:t>
+      </w:r>
+    </w:p>
+    <w:p>
+      <w:pPr>
+        <w:keepNext/>
         <w:keepLines/>
       </w:pPr>
       <w:r>
@@ -25469,22 +25536,7 @@
           <w:color w:val="0B3060"/>
           <w:sz w:val="19"/>
         </w:rPr>
-        <w:t>Return only the SKILL.md text, starting with the --- front matter.</w:t>
-      </w:r>
-    </w:p>
-    <w:p>
-      <w:pPr>
-        <w:spacing w:after="80"/>
-        <w:ind w:left="360"/>
-      </w:pPr>
-      <w:r>
-        <w:rPr>
-          <w:b/>
-        </w:rPr>
-        <w:t xml:space="preserve">4.  </w:t>
-      </w:r>
-      <w:r>
-        <w:t>Save it as before: copy the reply into a plain-text file named SKILL.md, create the folder hr-workforce-dashboard in your OneDrive skills folder and upload the file (or upload the ready-made one from this lab folder). In Excel select Settings (...) &gt; Manage plugins &amp; skills &gt; Custom skills &gt; Refresh and turn the skill on.</w:t>
+        <w:t>2) Add helper columns Active_Start, Exit_In_Period and Tenure_Years using the period in the rules.</w:t>
       </w:r>
     </w:p>
     <w:p>
@@ -25498,11 +25550,12 @@
           <w:color w:val="0B3060"/>
           <w:sz w:val="19"/>
         </w:rPr>
-        <w:t>OneDrive : .../skills/hr-workforce-dashboard/SKILL.md</w:t>
-      </w:r>
-    </w:p>
-    <w:p>
-      <w:pPr>
+        <w:t>3) Create a Checks sheet with independent COUNTIFS formulas for active headcount (Status Active), headcount at period start, headcount at period end, exits, voluntary exits, attrition rate and hires.</w:t>
+      </w:r>
+    </w:p>
+    <w:p>
+      <w:pPr>
+        <w:keepNext/>
         <w:keepLines/>
       </w:pPr>
       <w:r>
@@ -25511,22 +25564,7 @@
           <w:color w:val="0B3060"/>
           <w:sz w:val="19"/>
         </w:rPr>
-        <w:t>Check    : folder name = name: line = hr-workforce-dashboard</w:t>
-      </w:r>
-    </w:p>
-    <w:p>
-      <w:pPr>
-        <w:spacing w:after="80"/>
-        <w:ind w:left="360"/>
-      </w:pPr>
-      <w:r>
-        <w:rPr>
-          <w:b/>
-        </w:rPr>
-        <w:t xml:space="preserve">5.  </w:t>
-      </w:r>
-      <w:r>
-        <w:t>Run the skill in Plan mode: one line replaces the long brief, because the skill holds the steps and the rules hold the definitions. Review the plan, approve it, and select Done when Copilot finishes.</w:t>
+        <w:t>4) Put all PivotTables on Dash_Data.</w:t>
       </w:r>
     </w:p>
     <w:p>
@@ -25540,11 +25578,12 @@
           <w:color w:val="0B3060"/>
           <w:sz w:val="19"/>
         </w:rPr>
-        <w:t>PLAN MODE:</w:t>
-      </w:r>
-    </w:p>
-    <w:p>
-      <w:pPr>
+        <w:t>5) Build HR_Dashboard: six KPI cards (Active headcount, Exits, Attrition rate, Voluntary attrition rate,</w:t>
+      </w:r>
+    </w:p>
+    <w:p>
+      <w:pPr>
+        <w:keepNext/>
         <w:keepLines/>
       </w:pPr>
       <w:r>
@@ -25553,22 +25592,7 @@
           <w:color w:val="0B3060"/>
           <w:sz w:val="19"/>
         </w:rPr>
-        <w:t>@hr-workforce-dashboard Build the workforce dashboard for the 12 months ending 2026-06-30.</w:t>
-      </w:r>
-    </w:p>
-    <w:p>
-      <w:pPr>
-        <w:spacing w:after="80"/>
-        <w:ind w:left="360"/>
-      </w:pPr>
-      <w:r>
-        <w:rPr>
-          <w:b/>
-        </w:rPr>
-        <w:t xml:space="preserve">6.  </w:t>
-      </w:r>
-      <w:r>
-        <w:t>Verify. Ask Copilot to compare the KPI cards with the Checks sheet the skill built, and to show the attrition formula. Compare both with the Test It values - a skill can build a wrong check too.</w:t>
+        <w:t xml:space="preserve">   Avg tenure of active staff, Hires), charts of headcount by Department, attrition rate by Department, hires vs exits by quarter and headcount by Location, and slicers for Location and Job_Level.</w:t>
       </w:r>
     </w:p>
     <w:p>
@@ -25582,7 +25606,7 @@
           <w:color w:val="0B3060"/>
           <w:sz w:val="19"/>
         </w:rPr>
-        <w:t>CHAT ONLY:</w:t>
+        <w:t>6) Compare every KPI card with Checks and report any difference.</w:t>
       </w:r>
     </w:p>
     <w:p>
@@ -25596,7 +25620,7 @@
           <w:color w:val="0B3060"/>
           <w:sz w:val="19"/>
         </w:rPr>
-        <w:t>Compare each KPI card on HR_Dashboard with the Checks sheet and tell me which, if any, do not match.</w:t>
+        <w:t>7) Check slicer combinations for groups smaller than 5; suppress their values and report the privacy check.</w:t>
       </w:r>
     </w:p>
     <w:p>
@@ -25610,12 +25634,11 @@
           <w:color w:val="0B3060"/>
           <w:sz w:val="19"/>
         </w:rPr>
-        <w:t>Show the formula behind the Attrition rate card.</w:t>
-      </w:r>
-    </w:p>
-    <w:p>
-      <w:pPr>
-        <w:keepNext/>
+        <w:t>8) Use tblEmployees as a dynamic source and refresh all PivotTables after new rows are appended.</w:t>
+      </w:r>
+    </w:p>
+    <w:p>
+      <w:pPr>
         <w:keepLines/>
       </w:pPr>
       <w:r>
@@ -25624,6 +25647,22 @@
           <w:color w:val="0B3060"/>
           <w:sz w:val="19"/>
         </w:rPr>
+        <w:t>Return only the full SKILL.md text, starting with the --- front matter, without code fences or commentary.</w:t>
+      </w:r>
+    </w:p>
+    <w:p>
+      <w:pPr>
+        <w:spacing w:after="80"/>
+        <w:ind w:left="360"/>
+      </w:pPr>
+      <w:r>
+        <w:rPr>
+          <w:b/>
+        </w:rPr>
+        <w:t xml:space="preserve">4.  </w:t>
+      </w:r>
+      <w:r>
+        <w:t>Copy the skill text from the web chat into a plain-text file named SKILL.md (not SKILL.md.txt). Do not include Markdown code fences around the file. Return to Excel: Settings (...) &gt; Manage plugins &amp; skills &gt; Custom skills &gt; Open skills folder (select Create OneDrive folder first if needed). Create the folder hr-workforce-dashboard in your OneDrive skills folder and upload the file (or upload the ready-made one from this lab folder). In Excel select Settings (...) &gt; Manage plugins &amp; skills &gt; Custom skills &gt; Refresh and turn the skill on.</w:t>
       </w:r>
     </w:p>
     <w:p>
@@ -25637,7 +25676,7 @@
           <w:color w:val="0B3060"/>
           <w:sz w:val="19"/>
         </w:rPr>
-        <w:t>ALLOW EDITING (if needed):</w:t>
+        <w:t>OneDrive : .../skills/hr-workforce-dashboard/SKILL.md</w:t>
       </w:r>
     </w:p>
     <w:p>
@@ -25650,7 +25689,7 @@
           <w:color w:val="0B3060"/>
           <w:sz w:val="19"/>
         </w:rPr>
-        <w:t>The attrition rate must use average headcount = (active on 2025-07-01 + active on 2026-06-30) / 2, as the rules say.</w:t>
+        <w:t>Check    : folder name = name: line = hr-workforce-dashboard</w:t>
       </w:r>
     </w:p>
     <w:p>
@@ -25662,10 +25701,10 @@
         <w:rPr>
           <w:b/>
         </w:rPr>
-        <w:t xml:space="preserve">7.  </w:t>
-      </w:r>
-      <w:r>
-        <w:t>Refresh test: ask Copilot to append the 8 rows from New_Joiners_Jul2026 to tblEmployees and refresh every PivotTable. Every KPI and chart that counts active staff must update.</w:t>
+        <w:t xml:space="preserve">5.  </w:t>
+      </w:r>
+      <w:r>
+        <w:t>Run the skill in Plan mode: one line replaces the long brief, because the skill holds the steps and the rules hold the definitions. Review the plan, approve it, and select Done when Copilot finishes.</w:t>
       </w:r>
     </w:p>
     <w:p>
@@ -25679,12 +25718,11 @@
           <w:color w:val="0B3060"/>
           <w:sz w:val="19"/>
         </w:rPr>
-        <w:t>ALLOW EDITING:</w:t>
-      </w:r>
-    </w:p>
-    <w:p>
-      <w:pPr>
-        <w:keepNext/>
+        <w:t>PLAN MODE:</w:t>
+      </w:r>
+    </w:p>
+    <w:p>
+      <w:pPr>
         <w:keepLines/>
       </w:pPr>
       <w:r>
@@ -25693,7 +25731,22 @@
           <w:color w:val="0B3060"/>
           <w:sz w:val="19"/>
         </w:rPr>
-        <w:t>Copy the 8 data rows in New_Joiners_Jul2026!A2:L9 to the first empty rows directly below tblEmployees so the table expands. Then refresh all PivotTables in the workbook and tell me the new Active headcount and the number of rows in tblEmployees.</w:t>
+        <w:t>@hr-workforce-dashboard Build the workforce dashboard for the 12 months ending 2026-06-30.</w:t>
+      </w:r>
+    </w:p>
+    <w:p>
+      <w:pPr>
+        <w:spacing w:after="80"/>
+        <w:ind w:left="360"/>
+      </w:pPr>
+      <w:r>
+        <w:rPr>
+          <w:b/>
+        </w:rPr>
+        <w:t xml:space="preserve">6.  </w:t>
+      </w:r>
+      <w:r>
+        <w:t>Verify. Ask Copilot to compare the KPI cards with the Checks sheet the skill built, and to show the attrition formula. Compare both with the Test It values - a skill can build a wrong check too.</w:t>
       </w:r>
     </w:p>
     <w:p>
@@ -25707,6 +25760,7 @@
           <w:color w:val="0B3060"/>
           <w:sz w:val="19"/>
         </w:rPr>
+        <w:t>CHAT ONLY:</w:t>
       </w:r>
     </w:p>
     <w:p>
@@ -25720,7 +25774,7 @@
           <w:color w:val="0B3060"/>
           <w:sz w:val="19"/>
         </w:rPr>
-        <w:t>Expected after refresh:</w:t>
+        <w:t>Compare each KPI card on HR_Dashboard with the Checks sheet and tell me which, if any, do not match.</w:t>
       </w:r>
     </w:p>
     <w:p>
@@ -25734,7 +25788,7 @@
           <w:color w:val="0B3060"/>
           <w:sz w:val="19"/>
         </w:rPr>
-        <w:t>Active headcount : 237 -&gt; 245</w:t>
+        <w:t>Show the formula behind the Attrition rate card.</w:t>
       </w:r>
     </w:p>
     <w:p>
@@ -25748,11 +25802,11 @@
           <w:color w:val="0B3060"/>
           <w:sz w:val="19"/>
         </w:rPr>
-        <w:t>tblEmployees rows: 420 -&gt; 428</w:t>
-      </w:r>
-    </w:p>
-    <w:p>
-      <w:pPr>
+      </w:r>
+    </w:p>
+    <w:p>
+      <w:pPr>
+        <w:keepNext/>
         <w:keepLines/>
       </w:pPr>
       <w:r>
@@ -25761,27 +25815,11 @@
           <w:color w:val="0B3060"/>
           <w:sz w:val="19"/>
         </w:rPr>
-        <w:t>New joiners by department: Recruitment +2, Sales &amp; Client Services +2, IT +4</w:t>
-      </w:r>
-    </w:p>
-    <w:p>
-      <w:pPr>
-        <w:spacing w:after="80"/>
-        <w:ind w:left="360"/>
-      </w:pPr>
-      <w:r>
-        <w:rPr>
-          <w:b/>
-        </w:rPr>
-        <w:t xml:space="preserve">8.  </w:t>
-      </w:r>
-      <w:r>
-        <w:t>Check it is safe to share, then ask for a leadership summary that uses only dashboard numbers. Copilot drafts; you check every number before it leaves HR. Log your prompts.</w:t>
-      </w:r>
-    </w:p>
-    <w:p>
-      <w:pPr>
-        <w:keepNext/>
+        <w:t>ALLOW EDITING (if needed):</w:t>
+      </w:r>
+    </w:p>
+    <w:p>
+      <w:pPr>
         <w:keepLines/>
       </w:pPr>
       <w:r>
@@ -25790,7 +25828,22 @@
           <w:color w:val="0B3060"/>
           <w:sz w:val="19"/>
         </w:rPr>
-        <w:t>CHAT ONLY:</w:t>
+        <w:t>The attrition rate must use average headcount = (active on 2025-07-01 + active on 2026-06-30) / 2, as the rules say.</w:t>
+      </w:r>
+    </w:p>
+    <w:p>
+      <w:pPr>
+        <w:spacing w:after="80"/>
+        <w:ind w:left="360"/>
+      </w:pPr>
+      <w:r>
+        <w:rPr>
+          <w:b/>
+        </w:rPr>
+        <w:t xml:space="preserve">7.  </w:t>
+      </w:r>
+      <w:r>
+        <w:t>Refresh test: ask Copilot to append the 8 rows from New_Joiners_Jul2026 to tblEmployees and refresh every PivotTable. Every KPI and chart that counts active staff must update.</w:t>
       </w:r>
     </w:p>
     <w:p>
@@ -25804,7 +25857,7 @@
           <w:color w:val="0B3060"/>
           <w:sz w:val="19"/>
         </w:rPr>
-        <w:t>Review HR_Dashboard before I share it with the leadership team. Does any element expose individual employee data or a group smaller than 5? Is each KPI labelled with its period and definition?</w:t>
+        <w:t>ALLOW EDITING:</w:t>
       </w:r>
     </w:p>
     <w:p>
@@ -25818,6 +25871,7 @@
           <w:color w:val="0B3060"/>
           <w:sz w:val="19"/>
         </w:rPr>
+        <w:t>Copy the 8 data rows in New_Joiners_Jul2026!A2:L9 to the first empty rows directly below tblEmployees so the table expands. Then refresh all PivotTables in the workbook and tell me the new Active headcount and the number of rows in tblEmployees.</w:t>
       </w:r>
     </w:p>
     <w:p>
@@ -25831,7 +25885,6 @@
           <w:color w:val="0B3060"/>
           <w:sz w:val="19"/>
         </w:rPr>
-        <w:t>CHAT ONLY:</w:t>
       </w:r>
     </w:p>
     <w:p>
@@ -25845,7 +25898,7 @@
           <w:color w:val="0B3060"/>
           <w:sz w:val="19"/>
         </w:rPr>
-        <w:t>Write a 5-line summary of HR_Dashboard for BrightPath's leadership team. Use only numbers shown on the dashboard, and label any explanation as a hypothesis to test.</w:t>
+        <w:t>Expected after refresh:</w:t>
       </w:r>
     </w:p>
     <w:p>
@@ -25859,6 +25912,7 @@
           <w:color w:val="0B3060"/>
           <w:sz w:val="19"/>
         </w:rPr>
+        <w:t>Active headcount : 237 -&gt; 245</w:t>
       </w:r>
     </w:p>
     <w:p>
@@ -25872,7 +25926,7 @@
           <w:color w:val="0B3060"/>
           <w:sz w:val="19"/>
         </w:rPr>
-        <w:t>LOG (Allow editing):</w:t>
+        <w:t>tblEmployees rows: 420 -&gt; 428</w:t>
       </w:r>
     </w:p>
     <w:p>
@@ -25885,7 +25939,145 @@
           <w:color w:val="0B3060"/>
           <w:sz w:val="19"/>
         </w:rPr>
-        <w:t>Prompt_Log already lists every prompt in this lab. For each one I ran, fill in What Copilot did and How I verified, and set Decision to Keep. I will tell you any row to change to Revise or Undo.</w:t>
+        <w:t>New joiners by department: Recruitment +2, Sales &amp; Client Services +2, IT +4</w:t>
+      </w:r>
+    </w:p>
+    <w:p>
+      <w:pPr>
+        <w:spacing w:after="80"/>
+        <w:ind w:left="360"/>
+      </w:pPr>
+      <w:r>
+        <w:rPr>
+          <w:b/>
+        </w:rPr>
+        <w:t xml:space="preserve">8.  </w:t>
+      </w:r>
+      <w:r>
+        <w:t>Check it is safe to share, then ask for a leadership summary that uses only dashboard numbers. Copilot drafts; you check every number before it leaves HR. Manually fill in the Step 3 / Prompt B row in Prompt_Log: record that the web chat drafted SKILL.md and how you checked the front matter and steps. Excel Copilot cannot see that web conversation. Then log the Excel prompts with Prompt I.</w:t>
+      </w:r>
+    </w:p>
+    <w:p>
+      <w:pPr>
+        <w:keepNext/>
+        <w:keepLines/>
+      </w:pPr>
+      <w:r>
+        <w:rPr>
+          <w:rFonts w:ascii="Consolas" w:hAnsi="Consolas"/>
+          <w:color w:val="0B3060"/>
+          <w:sz w:val="19"/>
+        </w:rPr>
+        <w:t>CHAT ONLY:</w:t>
+      </w:r>
+    </w:p>
+    <w:p>
+      <w:pPr>
+        <w:keepNext/>
+        <w:keepLines/>
+      </w:pPr>
+      <w:r>
+        <w:rPr>
+          <w:rFonts w:ascii="Consolas" w:hAnsi="Consolas"/>
+          <w:color w:val="0B3060"/>
+          <w:sz w:val="19"/>
+        </w:rPr>
+        <w:t>Review HR_Dashboard before I share it with the leadership team. Does any element expose individual employee data or a group smaller than 5? Is each KPI labelled with its period and definition?</w:t>
+      </w:r>
+    </w:p>
+    <w:p>
+      <w:pPr>
+        <w:keepNext/>
+        <w:keepLines/>
+      </w:pPr>
+      <w:r>
+        <w:rPr>
+          <w:rFonts w:ascii="Consolas" w:hAnsi="Consolas"/>
+          <w:color w:val="0B3060"/>
+          <w:sz w:val="19"/>
+        </w:rPr>
+      </w:r>
+    </w:p>
+    <w:p>
+      <w:pPr>
+        <w:keepNext/>
+        <w:keepLines/>
+      </w:pPr>
+      <w:r>
+        <w:rPr>
+          <w:rFonts w:ascii="Consolas" w:hAnsi="Consolas"/>
+          <w:color w:val="0B3060"/>
+          <w:sz w:val="19"/>
+        </w:rPr>
+        <w:t>CHAT ONLY:</w:t>
+      </w:r>
+    </w:p>
+    <w:p>
+      <w:pPr>
+        <w:keepNext/>
+        <w:keepLines/>
+      </w:pPr>
+      <w:r>
+        <w:rPr>
+          <w:rFonts w:ascii="Consolas" w:hAnsi="Consolas"/>
+          <w:color w:val="0B3060"/>
+          <w:sz w:val="19"/>
+        </w:rPr>
+        <w:t>Write a 5-line summary of HR_Dashboard for BrightPath's leadership team. Use only numbers shown on the dashboard, and label any explanation as a hypothesis to test.</w:t>
+      </w:r>
+    </w:p>
+    <w:p>
+      <w:pPr>
+        <w:keepNext/>
+        <w:keepLines/>
+      </w:pPr>
+      <w:r>
+        <w:rPr>
+          <w:rFonts w:ascii="Consolas" w:hAnsi="Consolas"/>
+          <w:color w:val="0B3060"/>
+          <w:sz w:val="19"/>
+        </w:rPr>
+      </w:r>
+    </w:p>
+    <w:p>
+      <w:pPr>
+        <w:keepNext/>
+        <w:keepLines/>
+      </w:pPr>
+      <w:r>
+        <w:rPr>
+          <w:rFonts w:ascii="Consolas" w:hAnsi="Consolas"/>
+          <w:color w:val="0B3060"/>
+          <w:sz w:val="19"/>
+        </w:rPr>
+        <w:t>LOG (Allow editing):</w:t>
+      </w:r>
+    </w:p>
+    <w:p>
+      <w:pPr>
+        <w:keepNext/>
+        <w:keepLines/>
+      </w:pPr>
+      <w:r>
+        <w:rPr>
+          <w:rFonts w:ascii="Consolas" w:hAnsi="Consolas"/>
+          <w:color w:val="0B3060"/>
+          <w:sz w:val="19"/>
+        </w:rPr>
+        <w:t>In Prompt_Log, leave the Step 3 / Prompt B web-chat row unchanged. For each Excel prompt I ran, fill in What Copilot did and How I verified, and set Decision to Keep. Do not invent results for web prompts.</w:t>
+      </w:r>
+    </w:p>
+    <w:p>
+      <w:pPr>
+        <w:keepLines/>
+      </w:pPr>
+      <w:r>
+        <w:rPr>
+          <w:rFonts w:ascii="Consolas" w:hAnsi="Consolas"/>
+          <w:color w:val="0B3060"/>
+          <w:sz w:val="19"/>
+        </w:rPr>
+        <w:t>I will tell you any row to change to Revise or Undo.</w:t>
       </w:r>
     </w:p>
     <w:p>
@@ -25972,7 +26164,7 @@
               <w:rPr>
                 <w:sz w:val="19"/>
               </w:rPr>
-              <w:t>Write a skill</w:t>
+              <w:t>Write a skill · Microsoft 365 Copilot web</w:t>
             </w:r>
           </w:p>
         </w:tc>
@@ -25989,7 +26181,7 @@
               <w:rPr>
                 <w:sz w:val="19"/>
               </w:rPr>
-              <w:t>Write a SKILL.md named hr-workforce-dashboard that reads the .Rules sheet first and builds a verified workforce dashboard.</w:t>
+              <w:t>In the web chat at https://copilot.cloud.microsoft/, use the complete Step 3 prompt below to draft hr-workforce-dashboard. It includes the workbook schema and rules that this chat cannot see.</w:t>
             </w:r>
           </w:p>
         </w:tc>
@@ -26167,7 +26359,7 @@
               <w:rPr>
                 <w:sz w:val="19"/>
               </w:rPr>
-              <w:t>Improve the skill</w:t>
+              <w:t>Improve the skill · Microsoft 365 Copilot web</w:t>
             </w:r>
           </w:p>
         </w:tc>
@@ -26184,7 +26376,7 @@
               <w:rPr>
                 <w:sz w:val="19"/>
               </w:rPr>
-              <w:t>Update the hr-workforce-dashboard SKILL.md so it also adds a timeline on Hire_Date. Return the full file.</w:t>
+              <w:t>I will paste my current hr-workforce-dashboard SKILL.md below. Update it so it also adds a timeline on Hire_Date. Preserve its front matter, KPI definitions and privacy rules. Return the full file without code fences. If I have not pasted the file, ask me for it first.</w:t>
             </w:r>
           </w:p>
         </w:tc>
@@ -26605,6 +26797,84 @@
                 <w:sz w:val="19"/>
               </w:rPr>
               <w:t>Fix</w:t>
+            </w:r>
+          </w:p>
+        </w:tc>
+      </w:tr>
+      <w:tr>
+        <w:trPr>
+          <w:cantSplit/>
+        </w:trPr>
+        <w:tc>
+          <w:tcPr>
+            <w:tcW w:type="dxa" w:w="4320"/>
+          </w:tcPr>
+          <w:p>
+            <w:pPr>
+              <w:keepNext/>
+            </w:pPr>
+            <w:r/>
+            <w:r>
+              <w:rPr>
+                <w:sz w:val="19"/>
+              </w:rPr>
+              <w:t>The web chat asks to see my workbook or outputs a dashboard instead of SKILL.md.</w:t>
+            </w:r>
+          </w:p>
+        </w:tc>
+        <w:tc>
+          <w:tcPr>
+            <w:tcW w:type="dxa" w:w="4320"/>
+          </w:tcPr>
+          <w:p>
+            <w:pPr>
+              <w:keepNext/>
+            </w:pPr>
+            <w:r/>
+            <w:r>
+              <w:rPr>
+                <w:sz w:val="19"/>
+              </w:rPr>
+              <w:t>Use the full Step 3 prompt at https://copilot.cloud.microsoft/. Ask for reusable skill instructions only; the local workbook is used later in Excel. Do not upload it just to draft the skill.</w:t>
+            </w:r>
+          </w:p>
+        </w:tc>
+      </w:tr>
+      <w:tr>
+        <w:trPr>
+          <w:cantSplit/>
+        </w:trPr>
+        <w:tc>
+          <w:tcPr>
+            <w:tcW w:type="dxa" w:w="4320"/>
+          </w:tcPr>
+          <w:p>
+            <w:pPr>
+              <w:keepNext/>
+            </w:pPr>
+            <w:r/>
+            <w:r>
+              <w:rPr>
+                <w:sz w:val="19"/>
+              </w:rPr>
+              <w:t>The skill does not appear in Excel after saving.</w:t>
+            </w:r>
+          </w:p>
+        </w:tc>
+        <w:tc>
+          <w:tcPr>
+            <w:tcW w:type="dxa" w:w="4320"/>
+          </w:tcPr>
+          <w:p>
+            <w:pPr>
+              <w:keepNext/>
+            </w:pPr>
+            <w:r/>
+            <w:r>
+              <w:rPr>
+                <w:sz w:val="19"/>
+              </w:rPr>
+              <w:t>Use the skills folder opened from Excel, check the file is SKILL.md rather than SKILL.md.txt, and ensure the folder name and front-matter name are both hr-workforce-dashboard. Select Refresh and enable it. If custom skills are unavailable for your account, use the supplied skill text as a normal Excel prompt and record that the installation could not be completed.</w:t>
             </w:r>
           </w:p>
         </w:tc>

</xml_diff>

<commit_message>
docs: Lab 6 drafts the Pareto-chart skill in Microsoft 365 Copilot web
Lab 6 now sends learners to https://copilot.cloud.microsoft/ (the same
link Lab 8 uses) to draft the pareto-chart SKILL.md, and labels its web
prompts "Microsoft 365 Copilot web". Deck, Learner Guide, Lesson Plan,
labs and prompts page rebuilt; .gitignore now excludes *.zip and
**/reference/.

Co-Authored-By: Claude Sonnet 5.5 <noreply@anthropic.com>
</commit_message>
<xml_diff>
--- a/courseware/LG-Microsoft 365 Copilot for Excel.docx
+++ b/courseware/LG-Microsoft 365 Copilot for Excel.docx
@@ -17831,7 +17831,7 @@
     </w:p>
     <w:p>
       <w:r>
-        <w:t>You do not have to write SKILL.md yourself. Ask Copilot on the web (copilot.microsoft.com): describe the task, the input table, the output you want and the checks, and ask for a complete SKILL.md with front matter. You copy the reply into a plain-text file, upload it to the skill's OneDrive folder, refresh in Excel and call it. To improve the skill, ask Copilot to update the file and upload the new version over the old one.</w:t>
+        <w:t>You do not have to write SKILL.md yourself. Ask Microsoft 365 Copilot on the web (copilot.cloud.microsoft): describe the task, the input table, the output you want and the checks, and ask for a complete SKILL.md with front matter. You copy the reply into a plain-text file, upload it to the skill's OneDrive folder, refresh in Excel and call it. To improve the skill, ask Copilot to update the file and upload the new version over the old one.</w:t>
       </w:r>
     </w:p>
     <w:p>
@@ -18492,7 +18492,7 @@
         <w:keepNext/>
       </w:pPr>
       <w:r>
-        <w:t>A pareto-chart skill in your OneDrive skills folder, and BrightPath_Job_Postings.xlsx with a Pareto_Job_Category sheet and a Pareto_Client_Sector sheet - each a summary table and a Pareto chart with a different colour for every bar - plus a Checks sheet   (Tools: Copilot on the web (copilot.microsoft.com) to draft the skill · OneDrive skills folder · Excel Copilot (Chat only, Allow editing) · SKILL.md.)</w:t>
+        <w:t>A pareto-chart skill in your OneDrive skills folder, and BrightPath_Job_Postings.xlsx with a Pareto_Job_Category sheet and a Pareto_Client_Sector sheet - each a summary table and a Pareto chart with a different colour for every bar - plus a Checks sheet   (Tools: Microsoft 365 Copilot web (https://copilot.cloud.microsoft/) to draft the skill · OneDrive skills folder · Excel Copilot (Chat only, Allow editing) · SKILL.md.)</w:t>
       </w:r>
     </w:p>
     <w:p>
@@ -18521,7 +18521,7 @@
         <w:pStyle w:val="ListBullet"/>
       </w:pPr>
       <w:r>
-        <w:t>Access to https://copilot.microsoft.com with the account you use in Excel and OneDrive, and to your OneDrive in a browser (custom skills are stored there).</w:t>
+        <w:t>Access to https://copilot.cloud.microsoft/ with the same work account used in Excel and OneDrive, and to your OneDrive in a browser (custom skills are stored there).</w:t>
       </w:r>
     </w:p>
     <w:p>
@@ -18627,7 +18627,7 @@
         <w:t xml:space="preserve">2.  </w:t>
       </w:r>
       <w:r>
-        <w:t>Draft the skill in Copilot on the web. Open https://copilot.microsoft.com in your browser and sign in with the same account you use in Excel and OneDrive (with a work account you may be sent to Microsoft 365 Copilot Chat - use that chat). Start a new chat and paste the prompt below. The web chat cannot see your workbook, so the prompt describes the table, the chart and the colours. Read the reply: it must start with --- and include name: pareto-chart, a description that says when to use the skill, and numbered steps that give every column a different colour. Ask for corrections in this chat until you are happy.</w:t>
+        <w:t>Draft the skill in Microsoft 365 Copilot on the web. Open https://copilot.cloud.microsoft/ in your browser and sign in with the same work account used in Excel and OneDrive. Start a new chat and paste the prompt below. The web chat cannot see your workbook, so the prompt describes the table, the chart and the colours. Read the reply: it must start with --- and include name: pareto-chart, a description that says when to use the skill, and numbered steps that give every column a different colour. Ask for corrections in this chat until you are happy.</w:t>
       </w:r>
     </w:p>
     <w:p>
@@ -18641,7 +18641,7 @@
           <w:color w:val="0B3060"/>
           <w:sz w:val="19"/>
         </w:rPr>
-        <w:t>PROMPT (Microsoft Copilot web):</w:t>
+        <w:t>PROMPT (Microsoft 365 Copilot web):</w:t>
       </w:r>
     </w:p>
     <w:p>
@@ -19311,7 +19311,7 @@
           <w:color w:val="0B3060"/>
           <w:sz w:val="19"/>
         </w:rPr>
-        <w:t>PROMPT (Microsoft Copilot web):</w:t>
+        <w:t>PROMPT (Microsoft 365 Copilot web):</w:t>
       </w:r>
     </w:p>
     <w:p>
@@ -19507,7 +19507,7 @@
               <w:rPr>
                 <w:sz w:val="19"/>
               </w:rPr>
-              <w:t>Write a skill · Microsoft Copilot web</w:t>
+              <w:t>Write a skill · Microsoft 365 Copilot web</w:t>
             </w:r>
           </w:p>
         </w:tc>
@@ -19524,7 +19524,7 @@
               <w:rPr>
                 <w:sz w:val="19"/>
               </w:rPr>
-              <w:t>In the web chat at https://copilot.microsoft.com, use the complete Step 2 prompt below to draft pareto-chart. It describes the table, columns and chart because the web chat cannot see your workbook.</w:t>
+              <w:t>In the web chat at https://copilot.cloud.microsoft/, use the complete Step 2 prompt below to draft pareto-chart. It describes the table, columns and chart because the web chat cannot see your workbook.</w:t>
             </w:r>
           </w:p>
         </w:tc>
@@ -19738,7 +19738,7 @@
               <w:rPr>
                 <w:sz w:val="19"/>
               </w:rPr>
-              <w:t>Improve the skill · Microsoft Copilot web</w:t>
+              <w:t>Improve the skill · Microsoft 365 Copilot web</w:t>
             </w:r>
           </w:p>
         </w:tc>

</xml_diff>

<commit_message>
Release C34 v3.2 with consistent Pareto skill rerun instructions
</commit_message>
<xml_diff>
--- a/courseware/LG-Microsoft 365 Copilot for Excel.docx
+++ b/courseware/LG-Microsoft 365 Copilot for Excel.docx
@@ -179,7 +179,7 @@
           <w:color w:val="1F6FEB"/>
           <w:sz w:val="24"/>
         </w:rPr>
-        <w:t>Version 3.1</w:t>
+        <w:t>Version 3.2</w:t>
       </w:r>
     </w:p>
     <w:p>
@@ -280,6 +280,64 @@
                 <w:sz w:val="19"/>
               </w:rPr>
               <w:t>Author</w:t>
+            </w:r>
+          </w:p>
+        </w:tc>
+      </w:tr>
+      <w:tr>
+        <w:tc>
+          <w:tcPr>
+            <w:tcW w:type="dxa" w:w="1152"/>
+          </w:tcPr>
+          <w:p>
+            <w:r/>
+            <w:r>
+              <w:rPr>
+                <w:sz w:val="19"/>
+              </w:rPr>
+              <w:t>3.2</w:t>
+            </w:r>
+          </w:p>
+        </w:tc>
+        <w:tc>
+          <w:tcPr>
+            <w:tcW w:type="dxa" w:w="1656"/>
+          </w:tcPr>
+          <w:p>
+            <w:r/>
+            <w:r>
+              <w:rPr>
+                <w:sz w:val="19"/>
+              </w:rPr>
+              <w:t>13 October 2026</w:t>
+            </w:r>
+          </w:p>
+        </w:tc>
+        <w:tc>
+          <w:tcPr>
+            <w:tcW w:type="dxa" w:w="4896"/>
+          </w:tcPr>
+          <w:p>
+            <w:r/>
+            <w:r>
+              <w:rPr>
+                <w:sz w:val="19"/>
+              </w:rPr>
+              <w:t>Clarified the Pareto skill rerun: preserve source and unrelated sheets, replace only its matching output sheet.</w:t>
+            </w:r>
+          </w:p>
+        </w:tc>
+        <w:tc>
+          <w:tcPr>
+            <w:tcW w:type="dxa" w:w="1656"/>
+          </w:tcPr>
+          <w:p>
+            <w:r/>
+            <w:r>
+              <w:rPr>
+                <w:sz w:val="19"/>
+              </w:rPr>
+              <w:t>Assigned Tertiary Infotech Academy Trainer</w:t>
             </w:r>
           </w:p>
         </w:tc>
@@ -18739,7 +18797,7 @@
           <w:color w:val="0B3060"/>
           <w:sz w:val="19"/>
         </w:rPr>
-        <w:t>1) Never change the source table or any existing sheet.</w:t>
+        <w:t>1) Never change the source table or unrelated sheets. You may replace only the matching Pareto_&lt;column name&gt; output sheet when rerunning this skill.</w:t>
       </w:r>
     </w:p>
     <w:p>
@@ -18753,7 +18811,21 @@
           <w:color w:val="0B3060"/>
           <w:sz w:val="19"/>
         </w:rPr>
-        <w:t>2) Create a new sheet named Pareto_&lt;column name&gt; with a summary table: Category, Count, Share %, Cumulative %, sorted by Count from highest to lowest. Use formulas that read the source table so it updates when rows are added, and add a Total row.</w:t>
+        <w:t>2) Create a sheet named Pareto_&lt;column name&gt;; if it already exists, replace only its contents.</w:t>
+      </w:r>
+    </w:p>
+    <w:p>
+      <w:pPr>
+        <w:keepNext/>
+        <w:keepLines/>
+      </w:pPr>
+      <w:r>
+        <w:rPr>
+          <w:rFonts w:ascii="Consolas" w:hAnsi="Consolas"/>
+          <w:color w:val="0B3060"/>
+          <w:sz w:val="19"/>
+        </w:rPr>
+        <w:t>Build a summary table: Category, Count, Share %, Cumulative %, sorted by Count from highest to lowest. Use formulas that read the source table so it updates when rows are added, and add a Total row.</w:t>
       </w:r>
     </w:p>
     <w:p>

</xml_diff>